<commit_message>
[HYBRID] Iteration 3 documentation
</commit_message>
<xml_diff>
--- a/doc/CS673_SPPP_team1.docx
+++ b/doc/CS673_SPPP_team1.docx
@@ -565,7 +565,7 @@
                 <w:u w:val="single"/>
                 <w:rtl w:val="0"/>
               </w:rPr>
-              <w:t xml:space="preserve">09/20/2026</w:t>
+              <w:t xml:space="preserve">10/12/2026</w:t>
             </w:r>
           </w:p>
         </w:tc>
@@ -703,6 +703,356 @@
                 <w:rtl w:val="0"/>
               </w:rPr>
               <w:t xml:space="preserve">KimlengLim</w:t>
+            </w:r>
+          </w:p>
+        </w:tc>
+        <w:tc>
+          <w:tcPr>
+            <w:shd w:fill="auto" w:val="clear"/>
+            <w:tcMar>
+              <w:top w:w="100.0" w:type="dxa"/>
+              <w:left w:w="100.0" w:type="dxa"/>
+              <w:bottom w:w="100.0" w:type="dxa"/>
+              <w:right w:w="100.0" w:type="dxa"/>
+            </w:tcMar>
+            <w:vAlign w:val="top"/>
+          </w:tcPr>
+          <w:p>
+            <w:pPr>
+              <w:widowControl w:val="0"/>
+              <w:spacing w:line="240" w:lineRule="auto"/>
+              <w:rPr>
+                <w:sz w:val="24"/>
+                <w:szCs w:val="24"/>
+                <w:u w:val="single"/>
+              </w:rPr>
+            </w:pPr>
+            <w:r>
+              <w:rPr>
+                <w:sz w:val="24"/>
+                <w:szCs w:val="24"/>
+                <w:u w:val="single"/>
+                <w:rtl w:val="0"/>
+              </w:rPr>
+              <w:t xml:space="preserve">10/12/2026</w:t>
+            </w:r>
+          </w:p>
+        </w:tc>
+      </w:tr>
+      <w:tr>
+        <w:trPr>
+          <w:cantSplit w:val="0"/>
+          <w:tblHeader w:val="0"/>
+        </w:trPr>
+        <w:tc>
+          <w:tcPr>
+            <w:shd w:fill="auto" w:val="clear"/>
+            <w:tcMar>
+              <w:top w:w="0.0" w:type="dxa"/>
+              <w:left w:w="40.0" w:type="dxa"/>
+              <w:bottom w:w="0.0" w:type="dxa"/>
+              <w:right w:w="40.0" w:type="dxa"/>
+            </w:tcMar>
+            <w:vAlign w:val="bottom"/>
+          </w:tcPr>
+          <w:p>
+            <w:pPr>
+              <w:keepNext w:val="0"/>
+              <w:keepLines w:val="0"/>
+              <w:pageBreakBefore w:val="0"/>
+              <w:widowControl w:val="0"/>
+              <w:pBdr>
+                <w:top w:space="0" w:sz="0" w:val="nil"/>
+                <w:left w:space="0" w:sz="0" w:val="nil"/>
+                <w:bottom w:space="0" w:sz="0" w:val="nil"/>
+                <w:right w:space="0" w:sz="0" w:val="nil"/>
+                <w:between w:space="0" w:sz="0" w:val="nil"/>
+              </w:pBdr>
+              <w:shd w:fill="auto" w:val="clear"/>
+              <w:spacing w:line="240" w:lineRule="auto"/>
+              <w:rPr>
+                <w:sz w:val="24"/>
+                <w:szCs w:val="24"/>
+              </w:rPr>
+            </w:pPr>
+            <w:r>
+              <w:rPr>
+                <w:sz w:val="24"/>
+                <w:szCs w:val="24"/>
+                <w:rtl w:val="0"/>
+              </w:rPr>
+              <w:t xml:space="preserve">Krizma Nagi</w:t>
+            </w:r>
+          </w:p>
+        </w:tc>
+        <w:tc>
+          <w:tcPr>
+            <w:shd w:fill="auto" w:val="clear"/>
+            <w:tcMar>
+              <w:top w:w="100.0" w:type="dxa"/>
+              <w:left w:w="100.0" w:type="dxa"/>
+              <w:bottom w:w="100.0" w:type="dxa"/>
+              <w:right w:w="100.0" w:type="dxa"/>
+            </w:tcMar>
+            <w:vAlign w:val="top"/>
+          </w:tcPr>
+          <w:p>
+            <w:pPr>
+              <w:keepNext w:val="0"/>
+              <w:keepLines w:val="0"/>
+              <w:pageBreakBefore w:val="0"/>
+              <w:widowControl w:val="0"/>
+              <w:pBdr>
+                <w:top w:space="0" w:sz="0" w:val="nil"/>
+                <w:left w:space="0" w:sz="0" w:val="nil"/>
+                <w:bottom w:space="0" w:sz="0" w:val="nil"/>
+                <w:right w:space="0" w:sz="0" w:val="nil"/>
+                <w:between w:space="0" w:sz="0" w:val="nil"/>
+              </w:pBdr>
+              <w:shd w:fill="auto" w:val="clear"/>
+              <w:spacing w:after="0" w:before="0" w:line="240" w:lineRule="auto"/>
+              <w:ind w:left="0" w:firstLine="0"/>
+              <w:rPr>
+                <w:sz w:val="24"/>
+                <w:szCs w:val="24"/>
+              </w:rPr>
+            </w:pPr>
+            <w:r>
+              <w:rPr>
+                <w:sz w:val="24"/>
+                <w:szCs w:val="24"/>
+                <w:rtl w:val="0"/>
+              </w:rPr>
+              <w:t xml:space="preserve">Requirement Lead</w:t>
+            </w:r>
+          </w:p>
+        </w:tc>
+        <w:tc>
+          <w:tcPr>
+            <w:shd w:fill="auto" w:val="clear"/>
+            <w:tcMar>
+              <w:top w:w="100.0" w:type="dxa"/>
+              <w:left w:w="100.0" w:type="dxa"/>
+              <w:bottom w:w="100.0" w:type="dxa"/>
+              <w:right w:w="100.0" w:type="dxa"/>
+            </w:tcMar>
+            <w:vAlign w:val="top"/>
+          </w:tcPr>
+          <w:p>
+            <w:pPr>
+              <w:keepNext w:val="0"/>
+              <w:keepLines w:val="0"/>
+              <w:pageBreakBefore w:val="0"/>
+              <w:widowControl w:val="0"/>
+              <w:pBdr>
+                <w:top w:space="0" w:sz="0" w:val="nil"/>
+                <w:left w:space="0" w:sz="0" w:val="nil"/>
+                <w:bottom w:space="0" w:sz="0" w:val="nil"/>
+                <w:right w:space="0" w:sz="0" w:val="nil"/>
+                <w:between w:space="0" w:sz="0" w:val="nil"/>
+              </w:pBdr>
+              <w:shd w:fill="auto" w:val="clear"/>
+              <w:spacing w:after="0" w:before="0" w:line="240" w:lineRule="auto"/>
+              <w:ind w:left="0" w:firstLine="0"/>
+              <w:rPr>
+                <w:i w:val="1"/>
+                <w:iCs w:val="1"/>
+                <w:sz w:val="24"/>
+                <w:szCs w:val="24"/>
+                <w:u w:val="single"/>
+              </w:rPr>
+            </w:pPr>
+            <w:r>
+              <w:rPr>
+                <w:i w:val="1"/>
+                <w:iCs w:val="1"/>
+                <w:sz w:val="24"/>
+                <w:szCs w:val="24"/>
+                <w:u w:val="single"/>
+                <w:rtl w:val="0"/>
+              </w:rPr>
+              <w:t xml:space="preserve">KrizmaNagi</w:t>
+            </w:r>
+          </w:p>
+        </w:tc>
+        <w:tc>
+          <w:tcPr>
+            <w:shd w:fill="auto" w:val="clear"/>
+            <w:tcMar>
+              <w:top w:w="100.0" w:type="dxa"/>
+              <w:left w:w="100.0" w:type="dxa"/>
+              <w:bottom w:w="100.0" w:type="dxa"/>
+              <w:right w:w="100.0" w:type="dxa"/>
+            </w:tcMar>
+            <w:vAlign w:val="top"/>
+          </w:tcPr>
+          <w:p>
+            <w:pPr>
+              <w:keepNext w:val="0"/>
+              <w:keepLines w:val="0"/>
+              <w:pageBreakBefore w:val="0"/>
+              <w:widowControl w:val="0"/>
+              <w:pBdr>
+                <w:top w:space="0" w:sz="0" w:val="nil"/>
+                <w:left w:space="0" w:sz="0" w:val="nil"/>
+                <w:bottom w:space="0" w:sz="0" w:val="nil"/>
+                <w:right w:space="0" w:sz="0" w:val="nil"/>
+                <w:between w:space="0" w:sz="0" w:val="nil"/>
+              </w:pBdr>
+              <w:shd w:fill="auto" w:val="clear"/>
+              <w:spacing w:after="0" w:before="0" w:line="240" w:lineRule="auto"/>
+              <w:ind w:left="0" w:firstLine="0"/>
+              <w:rPr>
+                <w:sz w:val="24"/>
+                <w:szCs w:val="24"/>
+                <w:u w:val="single"/>
+              </w:rPr>
+            </w:pPr>
+            <w:r>
+              <w:rPr>
+                <w:sz w:val="24"/>
+                <w:szCs w:val="24"/>
+                <w:u w:val="single"/>
+                <w:rtl w:val="0"/>
+              </w:rPr>
+              <w:t xml:space="preserve">10/12/2026</w:t>
+            </w:r>
+          </w:p>
+        </w:tc>
+      </w:tr>
+      <w:tr>
+        <w:trPr>
+          <w:cantSplit w:val="0"/>
+          <w:tblHeader w:val="0"/>
+        </w:trPr>
+        <w:tc>
+          <w:tcPr>
+            <w:shd w:fill="auto" w:val="clear"/>
+            <w:tcMar>
+              <w:top w:w="0.0" w:type="dxa"/>
+              <w:left w:w="40.0" w:type="dxa"/>
+              <w:bottom w:w="0.0" w:type="dxa"/>
+              <w:right w:w="40.0" w:type="dxa"/>
+            </w:tcMar>
+            <w:vAlign w:val="bottom"/>
+          </w:tcPr>
+          <w:p>
+            <w:pPr>
+              <w:keepNext w:val="0"/>
+              <w:keepLines w:val="0"/>
+              <w:pageBreakBefore w:val="0"/>
+              <w:widowControl w:val="0"/>
+              <w:pBdr>
+                <w:top w:space="0" w:sz="0" w:val="nil"/>
+                <w:left w:space="0" w:sz="0" w:val="nil"/>
+                <w:bottom w:space="0" w:sz="0" w:val="nil"/>
+                <w:right w:space="0" w:sz="0" w:val="nil"/>
+                <w:between w:space="0" w:sz="0" w:val="nil"/>
+              </w:pBdr>
+              <w:shd w:fill="auto" w:val="clear"/>
+              <w:spacing w:line="240" w:lineRule="auto"/>
+              <w:rPr>
+                <w:sz w:val="24"/>
+                <w:szCs w:val="24"/>
+              </w:rPr>
+            </w:pPr>
+            <w:r>
+              <w:rPr>
+                <w:sz w:val="24"/>
+                <w:szCs w:val="24"/>
+                <w:rtl w:val="0"/>
+              </w:rPr>
+              <w:t xml:space="preserve">Andy Chang</w:t>
+            </w:r>
+          </w:p>
+        </w:tc>
+        <w:tc>
+          <w:tcPr>
+            <w:shd w:fill="auto" w:val="clear"/>
+            <w:tcMar>
+              <w:top w:w="100.0" w:type="dxa"/>
+              <w:left w:w="100.0" w:type="dxa"/>
+              <w:bottom w:w="100.0" w:type="dxa"/>
+              <w:right w:w="100.0" w:type="dxa"/>
+            </w:tcMar>
+            <w:vAlign w:val="top"/>
+          </w:tcPr>
+          <w:p>
+            <w:pPr>
+              <w:keepNext w:val="0"/>
+              <w:keepLines w:val="0"/>
+              <w:pageBreakBefore w:val="0"/>
+              <w:widowControl w:val="0"/>
+              <w:pBdr>
+                <w:top w:space="0" w:sz="0" w:val="nil"/>
+                <w:left w:space="0" w:sz="0" w:val="nil"/>
+                <w:bottom w:space="0" w:sz="0" w:val="nil"/>
+                <w:right w:space="0" w:sz="0" w:val="nil"/>
+                <w:between w:space="0" w:sz="0" w:val="nil"/>
+              </w:pBdr>
+              <w:shd w:fill="auto" w:val="clear"/>
+              <w:spacing w:after="0" w:before="0" w:line="240" w:lineRule="auto"/>
+              <w:ind w:left="0" w:firstLine="0"/>
+              <w:rPr>
+                <w:sz w:val="24"/>
+                <w:szCs w:val="24"/>
+              </w:rPr>
+            </w:pPr>
+            <w:r>
+              <w:rPr>
+                <w:sz w:val="24"/>
+                <w:szCs w:val="24"/>
+                <w:rtl w:val="0"/>
+              </w:rPr>
+              <w:t xml:space="preserve">Configuration Lead</w:t>
+            </w:r>
+          </w:p>
+        </w:tc>
+        <w:tc>
+          <w:tcPr>
+            <w:shd w:fill="auto" w:val="clear"/>
+            <w:tcMar>
+              <w:top w:w="100.0" w:type="dxa"/>
+              <w:left w:w="100.0" w:type="dxa"/>
+              <w:bottom w:w="100.0" w:type="dxa"/>
+              <w:right w:w="100.0" w:type="dxa"/>
+            </w:tcMar>
+            <w:vAlign w:val="top"/>
+          </w:tcPr>
+          <w:p>
+            <w:pPr>
+              <w:keepNext w:val="0"/>
+              <w:keepLines w:val="0"/>
+              <w:pageBreakBefore w:val="0"/>
+              <w:widowControl w:val="0"/>
+              <w:pBdr>
+                <w:top w:space="0" w:sz="0" w:val="nil"/>
+                <w:left w:space="0" w:sz="0" w:val="nil"/>
+                <w:bottom w:space="0" w:sz="0" w:val="nil"/>
+                <w:right w:space="0" w:sz="0" w:val="nil"/>
+                <w:between w:space="0" w:sz="0" w:val="nil"/>
+              </w:pBdr>
+              <w:shd w:fill="auto" w:val="clear"/>
+              <w:spacing w:after="0" w:before="0" w:line="240" w:lineRule="auto"/>
+              <w:ind w:left="0" w:firstLine="0"/>
+              <w:rPr>
+                <w:i w:val="1"/>
+                <w:iCs w:val="1"/>
+                <w:sz w:val="24"/>
+                <w:szCs w:val="24"/>
+                <w:u w:val="single"/>
+              </w:rPr>
+            </w:pPr>
+            <w:r>
+              <w:rPr>
+                <w:i w:val="1"/>
+                <w:iCs w:val="1"/>
+                <w:sz w:val="24"/>
+                <w:szCs w:val="24"/>
+                <w:u w:val="single"/>
+                <w:rtl w:val="0"/>
+              </w:rPr>
+              <w:t xml:space="preserve">Andy Chang</w:t>
             </w:r>
           </w:p>
         </w:tc>
@@ -793,368 +1143,6 @@
                 <w:szCs w:val="24"/>
                 <w:rtl w:val="0"/>
               </w:rPr>
-              <w:t xml:space="preserve">Krizma Nagi</w:t>
-            </w:r>
-          </w:p>
-        </w:tc>
-        <w:tc>
-          <w:tcPr>
-            <w:shd w:fill="auto" w:val="clear"/>
-            <w:tcMar>
-              <w:top w:w="100.0" w:type="dxa"/>
-              <w:left w:w="100.0" w:type="dxa"/>
-              <w:bottom w:w="100.0" w:type="dxa"/>
-              <w:right w:w="100.0" w:type="dxa"/>
-            </w:tcMar>
-            <w:vAlign w:val="top"/>
-          </w:tcPr>
-          <w:p>
-            <w:pPr>
-              <w:keepNext w:val="0"/>
-              <w:keepLines w:val="0"/>
-              <w:pageBreakBefore w:val="0"/>
-              <w:widowControl w:val="0"/>
-              <w:pBdr>
-                <w:top w:space="0" w:sz="0" w:val="nil"/>
-                <w:left w:space="0" w:sz="0" w:val="nil"/>
-                <w:bottom w:space="0" w:sz="0" w:val="nil"/>
-                <w:right w:space="0" w:sz="0" w:val="nil"/>
-                <w:between w:space="0" w:sz="0" w:val="nil"/>
-              </w:pBdr>
-              <w:shd w:fill="auto" w:val="clear"/>
-              <w:spacing w:after="0" w:before="0" w:line="240" w:lineRule="auto"/>
-              <w:ind w:left="0" w:firstLine="0"/>
-              <w:rPr>
-                <w:sz w:val="24"/>
-                <w:szCs w:val="24"/>
-              </w:rPr>
-            </w:pPr>
-            <w:r>
-              <w:rPr>
-                <w:sz w:val="24"/>
-                <w:szCs w:val="24"/>
-                <w:rtl w:val="0"/>
-              </w:rPr>
-              <w:t xml:space="preserve">Requirement Lead</w:t>
-            </w:r>
-          </w:p>
-        </w:tc>
-        <w:tc>
-          <w:tcPr>
-            <w:shd w:fill="auto" w:val="clear"/>
-            <w:tcMar>
-              <w:top w:w="100.0" w:type="dxa"/>
-              <w:left w:w="100.0" w:type="dxa"/>
-              <w:bottom w:w="100.0" w:type="dxa"/>
-              <w:right w:w="100.0" w:type="dxa"/>
-            </w:tcMar>
-            <w:vAlign w:val="top"/>
-          </w:tcPr>
-          <w:p>
-            <w:pPr>
-              <w:keepNext w:val="0"/>
-              <w:keepLines w:val="0"/>
-              <w:pageBreakBefore w:val="0"/>
-              <w:widowControl w:val="0"/>
-              <w:pBdr>
-                <w:top w:space="0" w:sz="0" w:val="nil"/>
-                <w:left w:space="0" w:sz="0" w:val="nil"/>
-                <w:bottom w:space="0" w:sz="0" w:val="nil"/>
-                <w:right w:space="0" w:sz="0" w:val="nil"/>
-                <w:between w:space="0" w:sz="0" w:val="nil"/>
-              </w:pBdr>
-              <w:shd w:fill="auto" w:val="clear"/>
-              <w:spacing w:after="0" w:before="0" w:line="240" w:lineRule="auto"/>
-              <w:ind w:left="0" w:firstLine="0"/>
-              <w:rPr>
-                <w:i w:val="1"/>
-                <w:iCs w:val="1"/>
-                <w:sz w:val="24"/>
-                <w:szCs w:val="24"/>
-                <w:u w:val="single"/>
-              </w:rPr>
-            </w:pPr>
-            <w:r>
-              <w:rPr>
-                <w:i w:val="1"/>
-                <w:iCs w:val="1"/>
-                <w:sz w:val="24"/>
-                <w:szCs w:val="24"/>
-                <w:u w:val="single"/>
-                <w:rtl w:val="0"/>
-              </w:rPr>
-              <w:t xml:space="preserve">KrizmaNagi</w:t>
-            </w:r>
-          </w:p>
-        </w:tc>
-        <w:tc>
-          <w:tcPr>
-            <w:shd w:fill="auto" w:val="clear"/>
-            <w:tcMar>
-              <w:top w:w="100.0" w:type="dxa"/>
-              <w:left w:w="100.0" w:type="dxa"/>
-              <w:bottom w:w="100.0" w:type="dxa"/>
-              <w:right w:w="100.0" w:type="dxa"/>
-            </w:tcMar>
-            <w:vAlign w:val="top"/>
-          </w:tcPr>
-          <w:p>
-            <w:pPr>
-              <w:keepNext w:val="0"/>
-              <w:keepLines w:val="0"/>
-              <w:pageBreakBefore w:val="0"/>
-              <w:widowControl w:val="0"/>
-              <w:pBdr>
-                <w:top w:space="0" w:sz="0" w:val="nil"/>
-                <w:left w:space="0" w:sz="0" w:val="nil"/>
-                <w:bottom w:space="0" w:sz="0" w:val="nil"/>
-                <w:right w:space="0" w:sz="0" w:val="nil"/>
-                <w:between w:space="0" w:sz="0" w:val="nil"/>
-              </w:pBdr>
-              <w:shd w:fill="auto" w:val="clear"/>
-              <w:spacing w:after="0" w:before="0" w:line="240" w:lineRule="auto"/>
-              <w:ind w:left="0" w:firstLine="0"/>
-              <w:rPr>
-                <w:sz w:val="24"/>
-                <w:szCs w:val="24"/>
-                <w:u w:val="single"/>
-              </w:rPr>
-            </w:pPr>
-            <w:r>
-              <w:rPr>
-                <w:sz w:val="24"/>
-                <w:szCs w:val="24"/>
-                <w:u w:val="single"/>
-                <w:rtl w:val="0"/>
-              </w:rPr>
-              <w:t xml:space="preserve">09/09/2026</w:t>
-            </w:r>
-          </w:p>
-        </w:tc>
-      </w:tr>
-      <w:tr>
-        <w:trPr>
-          <w:cantSplit w:val="0"/>
-          <w:tblHeader w:val="0"/>
-        </w:trPr>
-        <w:tc>
-          <w:tcPr>
-            <w:shd w:fill="auto" w:val="clear"/>
-            <w:tcMar>
-              <w:top w:w="0.0" w:type="dxa"/>
-              <w:left w:w="40.0" w:type="dxa"/>
-              <w:bottom w:w="0.0" w:type="dxa"/>
-              <w:right w:w="40.0" w:type="dxa"/>
-            </w:tcMar>
-            <w:vAlign w:val="bottom"/>
-          </w:tcPr>
-          <w:p>
-            <w:pPr>
-              <w:keepNext w:val="0"/>
-              <w:keepLines w:val="0"/>
-              <w:pageBreakBefore w:val="0"/>
-              <w:widowControl w:val="0"/>
-              <w:pBdr>
-                <w:top w:space="0" w:sz="0" w:val="nil"/>
-                <w:left w:space="0" w:sz="0" w:val="nil"/>
-                <w:bottom w:space="0" w:sz="0" w:val="nil"/>
-                <w:right w:space="0" w:sz="0" w:val="nil"/>
-                <w:between w:space="0" w:sz="0" w:val="nil"/>
-              </w:pBdr>
-              <w:shd w:fill="auto" w:val="clear"/>
-              <w:spacing w:line="240" w:lineRule="auto"/>
-              <w:rPr>
-                <w:sz w:val="24"/>
-                <w:szCs w:val="24"/>
-              </w:rPr>
-            </w:pPr>
-            <w:r>
-              <w:rPr>
-                <w:sz w:val="24"/>
-                <w:szCs w:val="24"/>
-                <w:rtl w:val="0"/>
-              </w:rPr>
-              <w:t xml:space="preserve">Andy Chang</w:t>
-            </w:r>
-          </w:p>
-        </w:tc>
-        <w:tc>
-          <w:tcPr>
-            <w:shd w:fill="auto" w:val="clear"/>
-            <w:tcMar>
-              <w:top w:w="100.0" w:type="dxa"/>
-              <w:left w:w="100.0" w:type="dxa"/>
-              <w:bottom w:w="100.0" w:type="dxa"/>
-              <w:right w:w="100.0" w:type="dxa"/>
-            </w:tcMar>
-            <w:vAlign w:val="top"/>
-          </w:tcPr>
-          <w:p>
-            <w:pPr>
-              <w:keepNext w:val="0"/>
-              <w:keepLines w:val="0"/>
-              <w:pageBreakBefore w:val="0"/>
-              <w:widowControl w:val="0"/>
-              <w:pBdr>
-                <w:top w:space="0" w:sz="0" w:val="nil"/>
-                <w:left w:space="0" w:sz="0" w:val="nil"/>
-                <w:bottom w:space="0" w:sz="0" w:val="nil"/>
-                <w:right w:space="0" w:sz="0" w:val="nil"/>
-                <w:between w:space="0" w:sz="0" w:val="nil"/>
-              </w:pBdr>
-              <w:shd w:fill="auto" w:val="clear"/>
-              <w:spacing w:after="0" w:before="0" w:line="240" w:lineRule="auto"/>
-              <w:ind w:left="0" w:firstLine="0"/>
-              <w:rPr>
-                <w:sz w:val="24"/>
-                <w:szCs w:val="24"/>
-              </w:rPr>
-            </w:pPr>
-            <w:r>
-              <w:rPr>
-                <w:sz w:val="24"/>
-                <w:szCs w:val="24"/>
-                <w:rtl w:val="0"/>
-              </w:rPr>
-              <w:t xml:space="preserve">Configuration Lead</w:t>
-            </w:r>
-          </w:p>
-        </w:tc>
-        <w:tc>
-          <w:tcPr>
-            <w:shd w:fill="auto" w:val="clear"/>
-            <w:tcMar>
-              <w:top w:w="100.0" w:type="dxa"/>
-              <w:left w:w="100.0" w:type="dxa"/>
-              <w:bottom w:w="100.0" w:type="dxa"/>
-              <w:right w:w="100.0" w:type="dxa"/>
-            </w:tcMar>
-            <w:vAlign w:val="top"/>
-          </w:tcPr>
-          <w:p>
-            <w:pPr>
-              <w:keepNext w:val="0"/>
-              <w:keepLines w:val="0"/>
-              <w:pageBreakBefore w:val="0"/>
-              <w:widowControl w:val="0"/>
-              <w:pBdr>
-                <w:top w:space="0" w:sz="0" w:val="nil"/>
-                <w:left w:space="0" w:sz="0" w:val="nil"/>
-                <w:bottom w:space="0" w:sz="0" w:val="nil"/>
-                <w:right w:space="0" w:sz="0" w:val="nil"/>
-                <w:between w:space="0" w:sz="0" w:val="nil"/>
-              </w:pBdr>
-              <w:shd w:fill="auto" w:val="clear"/>
-              <w:spacing w:after="0" w:before="0" w:line="240" w:lineRule="auto"/>
-              <w:ind w:left="0" w:firstLine="0"/>
-              <w:rPr>
-                <w:i w:val="1"/>
-                <w:iCs w:val="1"/>
-                <w:sz w:val="24"/>
-                <w:szCs w:val="24"/>
-                <w:u w:val="single"/>
-              </w:rPr>
-            </w:pPr>
-            <w:r>
-              <w:rPr>
-                <w:i w:val="1"/>
-                <w:iCs w:val="1"/>
-                <w:sz w:val="24"/>
-                <w:szCs w:val="24"/>
-                <w:u w:val="single"/>
-                <w:rtl w:val="0"/>
-              </w:rPr>
-              <w:t xml:space="preserve">Andy Chang</w:t>
-            </w:r>
-          </w:p>
-        </w:tc>
-        <w:tc>
-          <w:tcPr>
-            <w:shd w:fill="auto" w:val="clear"/>
-            <w:tcMar>
-              <w:top w:w="100.0" w:type="dxa"/>
-              <w:left w:w="100.0" w:type="dxa"/>
-              <w:bottom w:w="100.0" w:type="dxa"/>
-              <w:right w:w="100.0" w:type="dxa"/>
-            </w:tcMar>
-            <w:vAlign w:val="top"/>
-          </w:tcPr>
-          <w:p>
-            <w:pPr>
-              <w:keepNext w:val="0"/>
-              <w:keepLines w:val="0"/>
-              <w:pageBreakBefore w:val="0"/>
-              <w:widowControl w:val="0"/>
-              <w:pBdr>
-                <w:top w:space="0" w:sz="0" w:val="nil"/>
-                <w:left w:space="0" w:sz="0" w:val="nil"/>
-                <w:bottom w:space="0" w:sz="0" w:val="nil"/>
-                <w:right w:space="0" w:sz="0" w:val="nil"/>
-                <w:between w:space="0" w:sz="0" w:val="nil"/>
-              </w:pBdr>
-              <w:shd w:fill="auto" w:val="clear"/>
-              <w:spacing w:after="0" w:before="0" w:line="240" w:lineRule="auto"/>
-              <w:ind w:left="0" w:firstLine="0"/>
-              <w:rPr>
-                <w:sz w:val="24"/>
-                <w:szCs w:val="24"/>
-                <w:u w:val="single"/>
-              </w:rPr>
-            </w:pPr>
-            <w:r>
-              <w:rPr>
-                <w:sz w:val="24"/>
-                <w:szCs w:val="24"/>
-                <w:u w:val="single"/>
-                <w:rtl w:val="0"/>
-              </w:rPr>
-              <w:t xml:space="preserve">09/09/2026</w:t>
-            </w:r>
-          </w:p>
-        </w:tc>
-      </w:tr>
-      <w:tr>
-        <w:trPr>
-          <w:cantSplit w:val="0"/>
-          <w:tblHeader w:val="0"/>
-        </w:trPr>
-        <w:tc>
-          <w:tcPr>
-            <w:shd w:fill="auto" w:val="clear"/>
-            <w:tcMar>
-              <w:top w:w="0.0" w:type="dxa"/>
-              <w:left w:w="40.0" w:type="dxa"/>
-              <w:bottom w:w="0.0" w:type="dxa"/>
-              <w:right w:w="40.0" w:type="dxa"/>
-            </w:tcMar>
-            <w:vAlign w:val="bottom"/>
-          </w:tcPr>
-          <w:p>
-            <w:pPr>
-              <w:keepNext w:val="0"/>
-              <w:keepLines w:val="0"/>
-              <w:pageBreakBefore w:val="0"/>
-              <w:widowControl w:val="0"/>
-              <w:pBdr>
-                <w:top w:space="0" w:sz="0" w:val="nil"/>
-                <w:left w:space="0" w:sz="0" w:val="nil"/>
-                <w:bottom w:space="0" w:sz="0" w:val="nil"/>
-                <w:right w:space="0" w:sz="0" w:val="nil"/>
-                <w:between w:space="0" w:sz="0" w:val="nil"/>
-              </w:pBdr>
-              <w:shd w:fill="auto" w:val="clear"/>
-              <w:spacing w:line="240" w:lineRule="auto"/>
-              <w:rPr>
-                <w:sz w:val="24"/>
-                <w:szCs w:val="24"/>
-              </w:rPr>
-            </w:pPr>
-            <w:r>
-              <w:rPr>
-                <w:sz w:val="24"/>
-                <w:szCs w:val="24"/>
-                <w:rtl w:val="0"/>
-              </w:rPr>
               <w:t xml:space="preserve">Italia Tran</w:t>
             </w:r>
           </w:p>
@@ -1289,7 +1277,7 @@
                 <w:u w:val="single"/>
                 <w:rtl w:val="0"/>
               </w:rPr>
-              <w:t xml:space="preserve">09/09/2026</w:t>
+              <w:t xml:space="preserve">10/12/2026</w:t>
             </w:r>
           </w:p>
         </w:tc>
@@ -3293,63 +3281,16 @@
           <w:between w:space="0" w:sz="0" w:val="nil"/>
         </w:pBdr>
         <w:shd w:fill="auto" w:val="clear"/>
-        <w:ind w:left="360" w:firstLine="0"/>
+        <w:spacing w:before="0" w:lineRule="auto"/>
+        <w:ind w:left="0" w:firstLine="0"/>
         <w:rPr/>
       </w:pPr>
       <w:r>
-        <w:br w:type="page"/>
-      </w:r>
-      <w:r>
-        <w:rPr>
-          <w:rtl w:val="0"/>
-        </w:rPr>
-      </w:r>
-    </w:p>
-    <w:sdt>
-      <w:sdtPr>
-        <w:id w:val="-151786916"/>
-        <w:docPartObj>
-          <w:docPartGallery w:val="Table of Contents"/>
-          <w:docPartUnique w:val="1"/>
-        </w:docPartObj>
-      </w:sdtPr>
-      <w:sdtContent>
-        <w:p>
-          <w:pPr>
-            <w:keepNext w:val="0"/>
-            <w:keepLines w:val="0"/>
-            <w:pageBreakBefore w:val="0"/>
-            <w:widowControl w:val="0"/>
-            <w:pBdr>
-              <w:top w:space="0" w:sz="0" w:val="nil"/>
-              <w:left w:space="0" w:sz="0" w:val="nil"/>
-              <w:bottom w:space="0" w:sz="0" w:val="nil"/>
-              <w:right w:space="0" w:sz="0" w:val="nil"/>
-              <w:between w:space="0" w:sz="0" w:val="nil"/>
-            </w:pBdr>
-            <w:shd w:fill="auto" w:val="clear"/>
-            <w:ind w:left="360" w:firstLine="0"/>
-            <w:rPr>
-              <w:color w:val="1155cc"/>
-              <w:u w:val="single"/>
-            </w:rPr>
-          </w:pPr>
-          <w:r>
-            <w:fldChar w:fldCharType="begin"/>
-            <w:instrText xml:space="preserve"> TOC \h \u \z \n \t "Heading 1,1,Heading 2,2,Heading 3,3,Heading 4,4,Heading 5,5,Heading 6,6,"</w:instrText>
-            <w:fldChar w:fldCharType="separate"/>
-          </w:r>
-          <w:r>
-            <w:rPr>
-              <w:rtl w:val="0"/>
-            </w:rPr>
-          </w:r>
-          <w:r>
-            <w:fldChar w:fldCharType="end"/>
-          </w:r>
-        </w:p>
-      </w:sdtContent>
-    </w:sdt>
+        <w:rPr>
+          <w:rtl w:val="0"/>
+        </w:rPr>
+      </w:r>
+    </w:p>
     <w:p>
       <w:pPr>
         <w:keepNext w:val="0"/>
@@ -3365,7 +3306,55 @@
         </w:pBdr>
         <w:shd w:fill="auto" w:val="clear"/>
         <w:spacing w:before="0" w:lineRule="auto"/>
-        <w:ind w:left="360" w:firstLine="0"/>
+        <w:ind w:left="0" w:firstLine="0"/>
+        <w:rPr/>
+      </w:pPr>
+      <w:r>
+        <w:rPr>
+          <w:rtl w:val="0"/>
+        </w:rPr>
+      </w:r>
+    </w:p>
+    <w:p>
+      <w:pPr>
+        <w:keepNext w:val="0"/>
+        <w:keepLines w:val="0"/>
+        <w:pageBreakBefore w:val="0"/>
+        <w:widowControl w:val="0"/>
+        <w:pBdr>
+          <w:top w:space="0" w:sz="0" w:val="nil"/>
+          <w:left w:space="0" w:sz="0" w:val="nil"/>
+          <w:bottom w:space="0" w:sz="0" w:val="nil"/>
+          <w:right w:space="0" w:sz="0" w:val="nil"/>
+          <w:between w:space="0" w:sz="0" w:val="nil"/>
+        </w:pBdr>
+        <w:shd w:fill="auto" w:val="clear"/>
+        <w:spacing w:before="0" w:lineRule="auto"/>
+        <w:ind w:left="0" w:firstLine="0"/>
+        <w:rPr/>
+      </w:pPr>
+      <w:r>
+        <w:rPr>
+          <w:rtl w:val="0"/>
+        </w:rPr>
+      </w:r>
+    </w:p>
+    <w:p>
+      <w:pPr>
+        <w:keepNext w:val="0"/>
+        <w:keepLines w:val="0"/>
+        <w:pageBreakBefore w:val="0"/>
+        <w:widowControl w:val="0"/>
+        <w:pBdr>
+          <w:top w:space="0" w:sz="0" w:val="nil"/>
+          <w:left w:space="0" w:sz="0" w:val="nil"/>
+          <w:bottom w:space="0" w:sz="0" w:val="nil"/>
+          <w:right w:space="0" w:sz="0" w:val="nil"/>
+          <w:between w:space="0" w:sz="0" w:val="nil"/>
+        </w:pBdr>
+        <w:shd w:fill="auto" w:val="clear"/>
+        <w:spacing w:before="0" w:lineRule="auto"/>
+        <w:ind w:left="0" w:firstLine="0"/>
         <w:rPr/>
       </w:pPr>
       <w:r>
@@ -3376,7 +3365,7 @@
     </w:p>
     <w:sdt>
       <w:sdtPr>
-        <w:id w:val="-767484725"/>
+        <w:id w:val="42925624"/>
         <w:docPartObj>
           <w:docPartGallery w:val="Table of Contents"/>
           <w:docPartUnique w:val="1"/>
@@ -4825,7 +4814,7 @@
         <w:widowControl w:val="0"/>
         <w:numPr>
           <w:ilvl w:val="0"/>
-          <w:numId w:val="25"/>
+          <w:numId w:val="26"/>
         </w:numPr>
         <w:pBdr>
           <w:top w:space="0" w:sz="0" w:val="nil"/>
@@ -4922,7 +4911,7 @@
       <w:pPr>
         <w:numPr>
           <w:ilvl w:val="0"/>
-          <w:numId w:val="31"/>
+          <w:numId w:val="33"/>
         </w:numPr>
         <w:spacing w:after="0" w:lineRule="auto"/>
         <w:ind w:left="1440" w:hanging="360"/>
@@ -4952,7 +4941,7 @@
       <w:pPr>
         <w:numPr>
           <w:ilvl w:val="0"/>
-          <w:numId w:val="31"/>
+          <w:numId w:val="33"/>
         </w:numPr>
         <w:spacing w:after="0" w:lineRule="auto"/>
         <w:ind w:left="1440" w:hanging="360"/>
@@ -4982,7 +4971,7 @@
       <w:pPr>
         <w:numPr>
           <w:ilvl w:val="0"/>
-          <w:numId w:val="31"/>
+          <w:numId w:val="33"/>
         </w:numPr>
         <w:spacing w:after="0" w:lineRule="auto"/>
         <w:ind w:left="1440" w:hanging="360"/>
@@ -5190,7 +5179,7 @@
       <w:pPr>
         <w:numPr>
           <w:ilvl w:val="0"/>
-          <w:numId w:val="28"/>
+          <w:numId w:val="29"/>
         </w:numPr>
         <w:spacing w:after="0" w:afterAutospacing="0" w:lineRule="auto"/>
         <w:ind w:left="1440" w:hanging="360"/>
@@ -5217,7 +5206,7 @@
       <w:pPr>
         <w:numPr>
           <w:ilvl w:val="0"/>
-          <w:numId w:val="28"/>
+          <w:numId w:val="29"/>
         </w:numPr>
         <w:spacing w:after="0" w:afterAutospacing="0" w:lineRule="auto"/>
         <w:ind w:left="1440" w:hanging="360"/>
@@ -5244,7 +5233,7 @@
       <w:pPr>
         <w:numPr>
           <w:ilvl w:val="0"/>
-          <w:numId w:val="28"/>
+          <w:numId w:val="29"/>
         </w:numPr>
         <w:spacing w:after="0" w:afterAutospacing="0" w:lineRule="auto"/>
         <w:ind w:left="1440" w:hanging="360"/>
@@ -5271,7 +5260,7 @@
       <w:pPr>
         <w:numPr>
           <w:ilvl w:val="0"/>
-          <w:numId w:val="28"/>
+          <w:numId w:val="29"/>
         </w:numPr>
         <w:spacing w:after="0" w:afterAutospacing="0" w:lineRule="auto"/>
         <w:ind w:left="1440" w:hanging="360"/>
@@ -5303,7 +5292,7 @@
       <w:pPr>
         <w:numPr>
           <w:ilvl w:val="0"/>
-          <w:numId w:val="28"/>
+          <w:numId w:val="29"/>
         </w:numPr>
         <w:spacing w:after="0" w:afterAutospacing="0" w:lineRule="auto"/>
         <w:ind w:left="1440" w:hanging="360"/>
@@ -5331,7 +5320,7 @@
         <w:pStyle w:val="Heading1"/>
         <w:numPr>
           <w:ilvl w:val="0"/>
-          <w:numId w:val="25"/>
+          <w:numId w:val="26"/>
         </w:numPr>
         <w:ind w:left="720" w:hanging="360"/>
       </w:pPr>
@@ -5415,7 +5404,7 @@
         <w:widowControl w:val="0"/>
         <w:numPr>
           <w:ilvl w:val="0"/>
-          <w:numId w:val="20"/>
+          <w:numId w:val="21"/>
         </w:numPr>
         <w:spacing w:after="0" w:afterAutospacing="0" w:lineRule="auto"/>
         <w:ind w:left="1080" w:hanging="360"/>
@@ -5440,7 +5429,7 @@
         <w:widowControl w:val="0"/>
         <w:numPr>
           <w:ilvl w:val="0"/>
-          <w:numId w:val="20"/>
+          <w:numId w:val="21"/>
         </w:numPr>
         <w:spacing w:after="0" w:afterAutospacing="0" w:lineRule="auto"/>
         <w:ind w:left="1080" w:hanging="360"/>
@@ -5465,7 +5454,7 @@
         <w:widowControl w:val="0"/>
         <w:numPr>
           <w:ilvl w:val="0"/>
-          <w:numId w:val="20"/>
+          <w:numId w:val="21"/>
         </w:numPr>
         <w:spacing w:after="240" w:lineRule="auto"/>
         <w:ind w:left="1080" w:hanging="360"/>
@@ -5594,7 +5583,7 @@
         <w:pStyle w:val="Heading1"/>
         <w:numPr>
           <w:ilvl w:val="0"/>
-          <w:numId w:val="25"/>
+          <w:numId w:val="26"/>
         </w:numPr>
         <w:ind w:left="720" w:hanging="360"/>
       </w:pPr>
@@ -5652,7 +5641,7 @@
         <w:pageBreakBefore w:val="0"/>
         <w:numPr>
           <w:ilvl w:val="0"/>
-          <w:numId w:val="16"/>
+          <w:numId w:val="17"/>
         </w:numPr>
         <w:pBdr>
           <w:top w:space="0" w:sz="0" w:val="nil"/>
@@ -5809,7 +5798,7 @@
       <w:pPr>
         <w:numPr>
           <w:ilvl w:val="0"/>
-          <w:numId w:val="22"/>
+          <w:numId w:val="23"/>
         </w:numPr>
         <w:ind w:left="1440" w:hanging="360"/>
         <w:rPr>
@@ -5835,7 +5824,7 @@
       <w:pPr>
         <w:numPr>
           <w:ilvl w:val="0"/>
-          <w:numId w:val="22"/>
+          <w:numId w:val="23"/>
         </w:numPr>
         <w:ind w:left="1440" w:hanging="360"/>
         <w:rPr>
@@ -5861,7 +5850,7 @@
       <w:pPr>
         <w:numPr>
           <w:ilvl w:val="0"/>
-          <w:numId w:val="22"/>
+          <w:numId w:val="23"/>
         </w:numPr>
         <w:ind w:left="1440" w:hanging="360"/>
         <w:rPr>
@@ -5887,7 +5876,7 @@
       <w:pPr>
         <w:numPr>
           <w:ilvl w:val="0"/>
-          <w:numId w:val="22"/>
+          <w:numId w:val="23"/>
         </w:numPr>
         <w:ind w:left="1440" w:hanging="360"/>
         <w:rPr>
@@ -5913,7 +5902,7 @@
       <w:pPr>
         <w:numPr>
           <w:ilvl w:val="0"/>
-          <w:numId w:val="22"/>
+          <w:numId w:val="23"/>
         </w:numPr>
         <w:ind w:left="1440" w:hanging="360"/>
         <w:rPr>
@@ -5939,7 +5928,7 @@
       <w:pPr>
         <w:numPr>
           <w:ilvl w:val="0"/>
-          <w:numId w:val="22"/>
+          <w:numId w:val="23"/>
         </w:numPr>
         <w:ind w:left="1440" w:hanging="360"/>
         <w:rPr>
@@ -5965,7 +5954,7 @@
       <w:pPr>
         <w:numPr>
           <w:ilvl w:val="0"/>
-          <w:numId w:val="22"/>
+          <w:numId w:val="23"/>
         </w:numPr>
         <w:ind w:left="1440" w:hanging="360"/>
         <w:rPr>
@@ -5991,7 +5980,7 @@
       <w:pPr>
         <w:numPr>
           <w:ilvl w:val="0"/>
-          <w:numId w:val="22"/>
+          <w:numId w:val="23"/>
         </w:numPr>
         <w:ind w:left="1440" w:hanging="360"/>
         <w:rPr>
@@ -6017,7 +6006,7 @@
       <w:pPr>
         <w:numPr>
           <w:ilvl w:val="0"/>
-          <w:numId w:val="22"/>
+          <w:numId w:val="23"/>
         </w:numPr>
         <w:ind w:left="1440" w:hanging="360"/>
         <w:rPr>
@@ -6043,7 +6032,7 @@
       <w:pPr>
         <w:numPr>
           <w:ilvl w:val="0"/>
-          <w:numId w:val="22"/>
+          <w:numId w:val="23"/>
         </w:numPr>
         <w:ind w:left="1440" w:hanging="360"/>
         <w:rPr>
@@ -6069,7 +6058,7 @@
       <w:pPr>
         <w:numPr>
           <w:ilvl w:val="0"/>
-          <w:numId w:val="22"/>
+          <w:numId w:val="23"/>
         </w:numPr>
         <w:ind w:left="1440" w:hanging="360"/>
         <w:rPr>
@@ -6095,7 +6084,7 @@
       <w:pPr>
         <w:numPr>
           <w:ilvl w:val="0"/>
-          <w:numId w:val="22"/>
+          <w:numId w:val="23"/>
         </w:numPr>
         <w:ind w:left="1440" w:hanging="360"/>
         <w:rPr>
@@ -6121,7 +6110,7 @@
       <w:pPr>
         <w:numPr>
           <w:ilvl w:val="0"/>
-          <w:numId w:val="22"/>
+          <w:numId w:val="23"/>
         </w:numPr>
         <w:ind w:left="1440" w:hanging="360"/>
         <w:rPr>
@@ -6147,7 +6136,7 @@
       <w:pPr>
         <w:numPr>
           <w:ilvl w:val="0"/>
-          <w:numId w:val="22"/>
+          <w:numId w:val="23"/>
         </w:numPr>
         <w:ind w:left="1440" w:hanging="360"/>
         <w:rPr>
@@ -6173,7 +6162,7 @@
       <w:pPr>
         <w:numPr>
           <w:ilvl w:val="0"/>
-          <w:numId w:val="22"/>
+          <w:numId w:val="23"/>
         </w:numPr>
         <w:ind w:left="1440" w:hanging="360"/>
         <w:rPr>
@@ -6199,7 +6188,7 @@
       <w:pPr>
         <w:numPr>
           <w:ilvl w:val="0"/>
-          <w:numId w:val="22"/>
+          <w:numId w:val="23"/>
         </w:numPr>
         <w:ind w:left="1440" w:hanging="360"/>
         <w:rPr>
@@ -6225,7 +6214,7 @@
       <w:pPr>
         <w:numPr>
           <w:ilvl w:val="0"/>
-          <w:numId w:val="22"/>
+          <w:numId w:val="23"/>
         </w:numPr>
         <w:ind w:left="1440" w:hanging="360"/>
         <w:rPr>
@@ -6688,7 +6677,7 @@
         <w:pageBreakBefore w:val="0"/>
         <w:numPr>
           <w:ilvl w:val="0"/>
-          <w:numId w:val="18"/>
+          <w:numId w:val="19"/>
         </w:numPr>
         <w:pBdr>
           <w:top w:space="0" w:sz="0" w:val="nil"/>
@@ -6715,7 +6704,7 @@
         <w:pageBreakBefore w:val="0"/>
         <w:numPr>
           <w:ilvl w:val="0"/>
-          <w:numId w:val="18"/>
+          <w:numId w:val="19"/>
         </w:numPr>
         <w:pBdr>
           <w:top w:space="0" w:sz="0" w:val="nil"/>
@@ -6762,7 +6751,7 @@
         <w:pageBreakBefore w:val="0"/>
         <w:numPr>
           <w:ilvl w:val="0"/>
-          <w:numId w:val="32"/>
+          <w:numId w:val="34"/>
         </w:numPr>
         <w:pBdr>
           <w:top w:space="0" w:sz="0" w:val="nil"/>
@@ -6789,7 +6778,7 @@
         <w:pageBreakBefore w:val="0"/>
         <w:numPr>
           <w:ilvl w:val="0"/>
-          <w:numId w:val="32"/>
+          <w:numId w:val="34"/>
         </w:numPr>
         <w:pBdr>
           <w:top w:space="0" w:sz="0" w:val="nil"/>
@@ -6891,7 +6880,7 @@
       <w:pPr>
         <w:numPr>
           <w:ilvl w:val="0"/>
-          <w:numId w:val="29"/>
+          <w:numId w:val="31"/>
         </w:numPr>
         <w:ind w:left="1440" w:hanging="360"/>
         <w:rPr>
@@ -6909,7 +6898,7 @@
       <w:pPr>
         <w:numPr>
           <w:ilvl w:val="0"/>
-          <w:numId w:val="29"/>
+          <w:numId w:val="31"/>
         </w:numPr>
         <w:ind w:left="1440" w:hanging="360"/>
         <w:rPr>
@@ -7040,7 +7029,7 @@
         <w:widowControl w:val="0"/>
         <w:numPr>
           <w:ilvl w:val="0"/>
-          <w:numId w:val="25"/>
+          <w:numId w:val="26"/>
         </w:numPr>
         <w:pBdr>
           <w:top w:space="0" w:sz="0" w:val="nil"/>
@@ -7113,7 +7102,7 @@
       <w:pPr>
         <w:numPr>
           <w:ilvl w:val="0"/>
-          <w:numId w:val="23"/>
+          <w:numId w:val="24"/>
         </w:numPr>
         <w:spacing w:after="0" w:afterAutospacing="0" w:lineRule="auto"/>
         <w:ind w:left="1440" w:hanging="360"/>
@@ -7140,7 +7129,7 @@
       <w:pPr>
         <w:numPr>
           <w:ilvl w:val="0"/>
-          <w:numId w:val="23"/>
+          <w:numId w:val="24"/>
         </w:numPr>
         <w:spacing w:after="0" w:afterAutospacing="0" w:lineRule="auto"/>
         <w:ind w:left="1440" w:hanging="360"/>
@@ -7167,7 +7156,7 @@
       <w:pPr>
         <w:numPr>
           <w:ilvl w:val="0"/>
-          <w:numId w:val="23"/>
+          <w:numId w:val="24"/>
         </w:numPr>
         <w:spacing w:after="0" w:afterAutospacing="0" w:lineRule="auto"/>
         <w:ind w:left="1440" w:hanging="360"/>
@@ -7194,7 +7183,7 @@
       <w:pPr>
         <w:numPr>
           <w:ilvl w:val="0"/>
-          <w:numId w:val="23"/>
+          <w:numId w:val="24"/>
         </w:numPr>
         <w:spacing w:after="240" w:lineRule="auto"/>
         <w:ind w:left="1440" w:hanging="360"/>
@@ -7235,7 +7224,7 @@
       <w:pPr>
         <w:numPr>
           <w:ilvl w:val="0"/>
-          <w:numId w:val="34"/>
+          <w:numId w:val="36"/>
         </w:numPr>
         <w:spacing w:after="0" w:afterAutospacing="0" w:lineRule="auto"/>
         <w:ind w:left="1440" w:hanging="360"/>
@@ -7262,7 +7251,7 @@
       <w:pPr>
         <w:numPr>
           <w:ilvl w:val="0"/>
-          <w:numId w:val="34"/>
+          <w:numId w:val="36"/>
         </w:numPr>
         <w:spacing w:after="240" w:lineRule="auto"/>
         <w:ind w:left="1440" w:hanging="360"/>
@@ -7303,7 +7292,7 @@
       <w:pPr>
         <w:numPr>
           <w:ilvl w:val="0"/>
-          <w:numId w:val="33"/>
+          <w:numId w:val="35"/>
         </w:numPr>
         <w:spacing w:after="240" w:lineRule="auto"/>
         <w:ind w:left="1440" w:hanging="360"/>
@@ -7450,7 +7439,7 @@
       <w:pPr>
         <w:numPr>
           <w:ilvl w:val="0"/>
-          <w:numId w:val="17"/>
+          <w:numId w:val="18"/>
         </w:numPr>
         <w:spacing w:after="0" w:afterAutospacing="0" w:lineRule="auto"/>
         <w:ind w:left="1440" w:hanging="360"/>
@@ -7477,7 +7466,7 @@
       <w:pPr>
         <w:numPr>
           <w:ilvl w:val="0"/>
-          <w:numId w:val="17"/>
+          <w:numId w:val="18"/>
         </w:numPr>
         <w:spacing w:after="240" w:lineRule="auto"/>
         <w:ind w:left="1440" w:hanging="360"/>
@@ -7518,7 +7507,7 @@
       <w:pPr>
         <w:numPr>
           <w:ilvl w:val="0"/>
-          <w:numId w:val="27"/>
+          <w:numId w:val="28"/>
         </w:numPr>
         <w:spacing w:after="0" w:afterAutospacing="0" w:lineRule="auto"/>
         <w:ind w:left="1440" w:hanging="360"/>
@@ -7545,7 +7534,7 @@
       <w:pPr>
         <w:numPr>
           <w:ilvl w:val="0"/>
-          <w:numId w:val="27"/>
+          <w:numId w:val="28"/>
         </w:numPr>
         <w:spacing w:after="240" w:lineRule="auto"/>
         <w:ind w:left="1440" w:hanging="360"/>
@@ -7586,7 +7575,7 @@
       <w:pPr>
         <w:numPr>
           <w:ilvl w:val="0"/>
-          <w:numId w:val="30"/>
+          <w:numId w:val="32"/>
         </w:numPr>
         <w:spacing w:after="0" w:afterAutospacing="0" w:lineRule="auto"/>
         <w:ind w:left="1440" w:hanging="360"/>
@@ -7613,7 +7602,7 @@
       <w:pPr>
         <w:numPr>
           <w:ilvl w:val="0"/>
-          <w:numId w:val="30"/>
+          <w:numId w:val="32"/>
         </w:numPr>
         <w:spacing w:after="240" w:lineRule="auto"/>
         <w:ind w:left="1440" w:hanging="360"/>
@@ -8156,7 +8145,7 @@
               <w:rPr>
                 <w:rtl w:val="0"/>
               </w:rPr>
-              <w:t xml:space="preserve"> Web Checkout Interface Baseline, Real-Time Low-Stock Checkout Alerts.</w:t>
+              <w:t xml:space="preserve"> Web Checkout Interface Baseline</w:t>
             </w:r>
           </w:p>
           <w:p>
@@ -8177,7 +8166,7 @@
               <w:rPr>
                 <w:rtl w:val="0"/>
               </w:rPr>
-              <w:t xml:space="preserve"> Sales/Inventory Report Exporting (CSV), Print Receipts.</w:t>
+              <w:t xml:space="preserve"> Generate Receipts.</w:t>
             </w:r>
           </w:p>
         </w:tc>
@@ -8254,7 +8243,7 @@
         <w:pageBreakBefore w:val="0"/>
         <w:numPr>
           <w:ilvl w:val="0"/>
-          <w:numId w:val="24"/>
+          <w:numId w:val="25"/>
         </w:numPr>
         <w:ind w:left="1440" w:hanging="360"/>
         <w:rPr>
@@ -8273,7 +8262,7 @@
         <w:pageBreakBefore w:val="0"/>
         <w:numPr>
           <w:ilvl w:val="0"/>
-          <w:numId w:val="24"/>
+          <w:numId w:val="25"/>
         </w:numPr>
         <w:ind w:left="1440" w:hanging="360"/>
         <w:rPr>
@@ -8285,6 +8274,25 @@
           <w:rtl w:val="0"/>
         </w:rPr>
         <w:t xml:space="preserve">Iteration 2 scope was reduced by moving the essential features Sales Checkout, Low-Stock Checkout Alerts, Printed/Digital Receipts, and Report Exports. All remaining features were removed from the roadmap. This scope change was a result of slow development and roadblocks in testing.</w:t>
+      </w:r>
+    </w:p>
+    <w:p>
+      <w:pPr>
+        <w:pageBreakBefore w:val="0"/>
+        <w:numPr>
+          <w:ilvl w:val="0"/>
+          <w:numId w:val="25"/>
+        </w:numPr>
+        <w:ind w:left="1440" w:hanging="360"/>
+        <w:rPr>
+          <w:u w:val="none"/>
+        </w:rPr>
+      </w:pPr>
+      <w:r>
+        <w:rPr>
+          <w:rtl w:val="0"/>
+        </w:rPr>
+        <w:t xml:space="preserve">Iteration 3 scope was reduced by moving the essential features Low-Stock Checkout Alerts and Report Exports. This was a result of a design gap that needed to be addressed instead. The design gap was related to managers/admins not being able to set the Sale Price of products. The design accounted for setting Stock Cost when adding Stock quantities to the inventory, but no input fields for setting Sale Price of Products from the inventory.</w:t>
       </w:r>
       <w:r>
         <w:rPr>
@@ -8300,7 +8308,7 @@
         <w:widowControl w:val="0"/>
         <w:numPr>
           <w:ilvl w:val="0"/>
-          <w:numId w:val="25"/>
+          <w:numId w:val="26"/>
         </w:numPr>
         <w:ind w:left="720" w:hanging="360"/>
       </w:pPr>
@@ -8440,7 +8448,7 @@
       <w:pPr>
         <w:numPr>
           <w:ilvl w:val="0"/>
-          <w:numId w:val="35"/>
+          <w:numId w:val="37"/>
         </w:numPr>
         <w:ind w:left="1440" w:hanging="360"/>
         <w:rPr>
@@ -8492,7 +8500,7 @@
       <w:pPr>
         <w:numPr>
           <w:ilvl w:val="0"/>
-          <w:numId w:val="21"/>
+          <w:numId w:val="22"/>
         </w:numPr>
         <w:ind w:left="1440" w:hanging="360"/>
         <w:rPr>
@@ -8851,27 +8859,12 @@
           <w:numId w:val="15"/>
         </w:numPr>
         <w:ind w:left="1440" w:hanging="360"/>
-        <w:rPr>
-          <w:u w:val="none"/>
-        </w:rPr>
-      </w:pPr>
-      <w:r>
-        <w:rPr>
-          <w:rtl w:val="0"/>
-        </w:rPr>
-        <w:t xml:space="preserve">Front-end testing will use Vitest as part of the testing framework as the project is Angular based. Each feature that is created should have its own *</w:t>
-      </w:r>
-      <w:r>
-        <w:rPr>
-          <w:rtl w:val="0"/>
-        </w:rPr>
-        <w:t xml:space="preserve">spec.ts</w:t>
-      </w:r>
-      <w:r>
-        <w:rPr>
-          <w:rtl w:val="0"/>
-        </w:rPr>
-        <w:t xml:space="preserve"> file where the unit tests will be implemented. Code coverage will be done through the default Angular framework and the resulting summary will be posted in the Frontend CI Test workflow run for every accepted pull request.</w:t>
+      </w:pPr>
+      <w:r>
+        <w:rPr>
+          <w:rtl w:val="0"/>
+        </w:rPr>
+        <w:t xml:space="preserve">Back-end testing will use the JUnit/Mockito framework. All the test files are located under /code/api/src/test. Code coverage will be done using JaCoCo  and the resulting summary will be posted in the Java CI with Maven workflow run for every accepted pull request.</w:t>
       </w:r>
     </w:p>
     <w:p>
@@ -8890,13 +8883,19 @@
         <w:rPr>
           <w:rtl w:val="0"/>
         </w:rPr>
-        <w:t xml:space="preserve">Back-end testing will use the </w:t>
-      </w:r>
-      <w:r>
-        <w:rPr>
-          <w:rtl w:val="0"/>
-        </w:rPr>
-        <w:t xml:space="preserve">JUnit/Mockito framework. All the test files are located under /code/api/src/test. Code coverage will be done using JaCoCo  and the resulting summary will be posted in the Java CI with Maven workflow run for every accepted pull request.</w:t>
+        <w:t xml:space="preserve">Front-end testing will use Vitest as part of the testing framework as the project is Angular based. Each feature that is created should have its own *</w:t>
+      </w:r>
+      <w:r>
+        <w:rPr>
+          <w:rtl w:val="0"/>
+        </w:rPr>
+        <w:t xml:space="preserve">spec.ts</w:t>
+      </w:r>
+      <w:r>
+        <w:rPr>
+          <w:rtl w:val="0"/>
+        </w:rPr>
+        <w:t xml:space="preserve"> file where the unit tests will be implemented. Code coverage will be done through the default Angular framework and the resulting summary will be posted in the Frontend CI Test workflow run for every accepted pull request.</w:t>
       </w:r>
     </w:p>
     <w:p>
@@ -8908,7 +8907,7 @@
         <w:widowControl w:val="0"/>
         <w:numPr>
           <w:ilvl w:val="0"/>
-          <w:numId w:val="25"/>
+          <w:numId w:val="26"/>
         </w:numPr>
         <w:pBdr>
           <w:top w:space="0" w:sz="0" w:val="nil"/>
@@ -9565,7 +9564,7 @@
         <w:widowControl w:val="0"/>
         <w:numPr>
           <w:ilvl w:val="0"/>
-          <w:numId w:val="26"/>
+          <w:numId w:val="27"/>
         </w:numPr>
         <w:spacing w:before="0" w:lineRule="auto"/>
         <w:ind w:left="1440" w:hanging="360"/>
@@ -9593,7 +9592,7 @@
         <w:widowControl w:val="0"/>
         <w:numPr>
           <w:ilvl w:val="0"/>
-          <w:numId w:val="26"/>
+          <w:numId w:val="27"/>
         </w:numPr>
         <w:spacing w:before="0" w:lineRule="auto"/>
         <w:ind w:left="1440" w:hanging="360"/>
@@ -9660,7 +9659,11 @@
     </w:p>
     <w:p>
       <w:pPr>
+        <w:pStyle w:val="Heading3"/>
+        <w:keepNext w:val="1"/>
+        <w:keepLines w:val="1"/>
         <w:pageBreakBefore w:val="0"/>
+        <w:widowControl w:val="1"/>
         <w:pBdr>
           <w:top w:space="0" w:sz="0" w:val="nil"/>
           <w:left w:space="0" w:sz="0" w:val="nil"/>
@@ -9669,6 +9672,28 @@
           <w:between w:space="0" w:sz="0" w:val="nil"/>
         </w:pBdr>
         <w:shd w:fill="auto" w:val="clear"/>
+        <w:spacing w:after="0" w:before="160" w:line="276" w:lineRule="auto"/>
+        <w:ind w:left="720" w:right="0" w:firstLine="0"/>
+        <w:jc w:val="left"/>
+        <w:rPr/>
+      </w:pPr>
+      <w:bookmarkStart w:colFirst="0" w:colLast="0" w:name="_wahxgziwlaol" w:id="53"/>
+      <w:bookmarkEnd w:id="53"/>
+      <w:r>
+        <w:rPr>
+          <w:rtl w:val="0"/>
+        </w:rPr>
+        <w:t xml:space="preserve">6.4.1. </w:t>
+      </w:r>
+      <w:r>
+        <w:rPr>
+          <w:rtl w:val="0"/>
+        </w:rPr>
+        <w:t xml:space="preserve">Back-end Testing</w:t>
+      </w:r>
+    </w:p>
+    <w:p>
+      <w:pPr>
         <w:ind w:left="720" w:firstLine="0"/>
         <w:rPr/>
       </w:pPr>
@@ -9676,28 +9701,93 @@
         <w:rPr>
           <w:rtl w:val="0"/>
         </w:rPr>
-        <w:t xml:space="preserve">The framework that will be used for unit testing will be </w:t>
-      </w:r>
-      <w:hyperlink r:id="rId9">
-        <w:r>
-          <w:rPr>
-            <w:color w:val="1155cc"/>
-            <w:u w:val="single"/>
-            <w:rtl w:val="0"/>
-          </w:rPr>
-          <w:t xml:space="preserve">JUnit 6</w:t>
-        </w:r>
-      </w:hyperlink>
-      <w:r>
-        <w:rPr>
-          <w:rtl w:val="0"/>
-        </w:rPr>
-        <w:t xml:space="preserve"> as that is the current version for the framework. However, this is subject to change based on the Java version that we will be using due to dependencies.</w:t>
-      </w:r>
-    </w:p>
-    <w:p>
-      <w:pPr>
+        <w:t xml:space="preserve">Back-end unit testing is powered by JUnit 5 (JUnit Jupiter) and Mockito, focusing on decoupled validation of business logic and API contracts. </w:t>
+      </w:r>
+    </w:p>
+    <w:p>
+      <w:pPr>
+        <w:numPr>
+          <w:ilvl w:val="0"/>
+          <w:numId w:val="30"/>
+        </w:numPr>
+        <w:ind w:left="1440" w:hanging="360"/>
+        <w:rPr>
+          <w:u w:val="none"/>
+        </w:rPr>
+      </w:pPr>
+      <w:r>
+        <w:rPr>
+          <w:rtl w:val="0"/>
+        </w:rPr>
+        <w:t xml:space="preserve">Service-layer tests isolate core domain rules and entity mapping by injecting mock repositories, verifying both calculated results and method interaction behavior. </w:t>
+      </w:r>
+    </w:p>
+    <w:p>
+      <w:pPr>
+        <w:numPr>
+          <w:ilvl w:val="0"/>
+          <w:numId w:val="30"/>
+        </w:numPr>
+        <w:ind w:left="1440" w:hanging="360"/>
+        <w:rPr>
+          <w:u w:val="none"/>
+        </w:rPr>
+      </w:pPr>
+      <w:r>
+        <w:rPr>
+          <w:rtl w:val="0"/>
+        </w:rPr>
+        <w:t xml:space="preserve">Controller-layer tests utilize Spring's </w:t>
+      </w:r>
+      <w:r>
+        <w:rPr>
+          <w:rtl w:val="0"/>
+        </w:rPr>
+        <w:t xml:space="preserve">@WebMvcTest</w:t>
+      </w:r>
+      <w:r>
+        <w:rPr>
+          <w:rtl w:val="0"/>
+        </w:rPr>
+        <w:t xml:space="preserve"> framework alongside </w:t>
+      </w:r>
+      <w:r>
+        <w:rPr>
+          <w:rtl w:val="0"/>
+        </w:rPr>
+        <w:t xml:space="preserve">MockMvc</w:t>
+      </w:r>
+      <w:r>
+        <w:rPr>
+          <w:rtl w:val="0"/>
+        </w:rPr>
+        <w:t xml:space="preserve"> and </w:t>
+      </w:r>
+      <w:r>
+        <w:rPr>
+          <w:rtl w:val="0"/>
+        </w:rPr>
+        <w:t xml:space="preserve">@MockitoBean</w:t>
+      </w:r>
+      <w:r>
+        <w:rPr>
+          <w:rtl w:val="0"/>
+        </w:rPr>
+        <w:t xml:space="preserve"> to validate REST endpoints without full server overhead, explicitly testing HTTP status responses, role-based authorization rules, CSRF protection, and standardized JSON payload structures.</w:t>
+      </w:r>
+      <w:r>
+        <w:rPr>
+          <w:rtl w:val="0"/>
+        </w:rPr>
+      </w:r>
+    </w:p>
+    <w:p>
+      <w:pPr>
+        <w:pStyle w:val="Heading3"/>
+        <w:keepNext w:val="1"/>
+        <w:keepLines w:val="1"/>
         <w:pageBreakBefore w:val="0"/>
+        <w:widowControl w:val="1"/>
         <w:pBdr>
           <w:top w:space="0" w:sz="0" w:val="nil"/>
           <w:left w:space="0" w:sz="0" w:val="nil"/>
@@ -9706,6 +9796,28 @@
           <w:between w:space="0" w:sz="0" w:val="nil"/>
         </w:pBdr>
         <w:shd w:fill="auto" w:val="clear"/>
+        <w:spacing w:after="0" w:before="160" w:line="276" w:lineRule="auto"/>
+        <w:ind w:left="720" w:right="0" w:firstLine="0"/>
+        <w:jc w:val="left"/>
+        <w:rPr/>
+      </w:pPr>
+      <w:bookmarkStart w:colFirst="0" w:colLast="0" w:name="_4hmdf2mynm5" w:id="54"/>
+      <w:bookmarkEnd w:id="54"/>
+      <w:r>
+        <w:rPr>
+          <w:rtl w:val="0"/>
+        </w:rPr>
+        <w:t xml:space="preserve">6.4.2. </w:t>
+      </w:r>
+      <w:r>
+        <w:rPr>
+          <w:rtl w:val="0"/>
+        </w:rPr>
+        <w:t xml:space="preserve">Front-end Testing</w:t>
+      </w:r>
+    </w:p>
+    <w:p>
+      <w:pPr>
         <w:ind w:left="720" w:firstLine="0"/>
         <w:rPr/>
       </w:pPr>
@@ -9713,23 +9825,72 @@
         <w:rPr>
           <w:rtl w:val="0"/>
         </w:rPr>
-        <w:t xml:space="preserve">As JUnit does not have a mocking system built in. Any mocks will use </w:t>
-      </w:r>
-      <w:hyperlink r:id="rId10">
-        <w:r>
-          <w:rPr>
-            <w:color w:val="1155cc"/>
-            <w:u w:val="single"/>
-            <w:rtl w:val="0"/>
-          </w:rPr>
-          <w:t xml:space="preserve">Mockito 5</w:t>
-        </w:r>
-      </w:hyperlink>
-      <w:r>
-        <w:rPr>
-          <w:rtl w:val="0"/>
-        </w:rPr>
-        <w:t xml:space="preserve"> to build mock objects for unit testing. Again, this is subject to change based on dependency issues.</w:t>
+        <w:t xml:space="preserve">Front-end unit testing leverages Vitest paired with Angular’s </w:t>
+      </w:r>
+      <w:r>
+        <w:rPr>
+          <w:rtl w:val="0"/>
+        </w:rPr>
+        <w:t xml:space="preserve">TestBed</w:t>
+      </w:r>
+      <w:r>
+        <w:rPr>
+          <w:rtl w:val="0"/>
+        </w:rPr>
+        <w:t xml:space="preserve"> utilities to deliver fast, isolated testing for UI logic and API interaction. </w:t>
+      </w:r>
+    </w:p>
+    <w:p>
+      <w:pPr>
+        <w:numPr>
+          <w:ilvl w:val="0"/>
+          <w:numId w:val="16"/>
+        </w:numPr>
+        <w:ind w:left="1440" w:hanging="360"/>
+        <w:rPr>
+          <w:u w:val="none"/>
+        </w:rPr>
+      </w:pPr>
+      <w:r>
+        <w:rPr>
+          <w:rtl w:val="0"/>
+        </w:rPr>
+        <w:t xml:space="preserve">Service tests rely on </w:t>
+      </w:r>
+      <w:r>
+        <w:rPr>
+          <w:rtl w:val="0"/>
+        </w:rPr>
+        <w:t xml:space="preserve">HttpTestingController</w:t>
+      </w:r>
+      <w:r>
+        <w:rPr>
+          <w:rtl w:val="0"/>
+        </w:rPr>
+        <w:t xml:space="preserve"> to intercept outbound network calls and verify endpoint routes, request payloads, and response mapping. </w:t>
+      </w:r>
+    </w:p>
+    <w:p>
+      <w:pPr>
+        <w:numPr>
+          <w:ilvl w:val="0"/>
+          <w:numId w:val="16"/>
+        </w:numPr>
+        <w:ind w:left="1440" w:hanging="360"/>
+        <w:rPr>
+          <w:u w:val="none"/>
+        </w:rPr>
+      </w:pPr>
+      <w:r>
+        <w:rPr>
+          <w:rtl w:val="0"/>
+        </w:rPr>
+        <w:t xml:space="preserve">Component tests evaluate UI behavior, Reactive Forms, custom input validators, event emissions, and Signal-based component state, while higher-level parent components are tested to ensure seamless layout composition and child component rendering.</w:t>
+      </w:r>
+      <w:r>
+        <w:rPr>
+          <w:rtl w:val="0"/>
+        </w:rPr>
       </w:r>
     </w:p>
     <w:p>
@@ -9738,13 +9899,13 @@
         <w:ind w:left="720" w:firstLine="0"/>
         <w:rPr/>
       </w:pPr>
-      <w:bookmarkStart w:colFirst="0" w:colLast="0" w:name="_f9xve9e195y9" w:id="53"/>
-      <w:bookmarkEnd w:id="53"/>
-      <w:r>
-        <w:rPr>
-          <w:rtl w:val="0"/>
-        </w:rPr>
-        <w:t xml:space="preserve">6.4.1. Types of Testing</w:t>
+      <w:bookmarkStart w:colFirst="0" w:colLast="0" w:name="_f9xve9e195y9" w:id="55"/>
+      <w:bookmarkEnd w:id="55"/>
+      <w:r>
+        <w:rPr>
+          <w:rtl w:val="0"/>
+        </w:rPr>
+        <w:t xml:space="preserve">6.4.3. Testing Stages</w:t>
       </w:r>
     </w:p>
     <w:p>
@@ -9752,7 +9913,7 @@
         <w:pageBreakBefore w:val="0"/>
         <w:numPr>
           <w:ilvl w:val="0"/>
-          <w:numId w:val="19"/>
+          <w:numId w:val="20"/>
         </w:numPr>
         <w:pBdr>
           <w:top w:space="0" w:sz="0" w:val="nil"/>
@@ -9795,7 +9956,7 @@
         <w:pageBreakBefore w:val="0"/>
         <w:numPr>
           <w:ilvl w:val="0"/>
-          <w:numId w:val="19"/>
+          <w:numId w:val="20"/>
         </w:numPr>
         <w:pBdr>
           <w:top w:space="0" w:sz="0" w:val="nil"/>
@@ -9843,8 +10004,8 @@
         <w:ind w:left="720" w:firstLine="0"/>
         <w:rPr/>
       </w:pPr>
-      <w:bookmarkStart w:colFirst="0" w:colLast="0" w:name="_5amsh8h9f0c7" w:id="54"/>
-      <w:bookmarkEnd w:id="54"/>
+      <w:bookmarkStart w:colFirst="0" w:colLast="0" w:name="_5amsh8h9f0c7" w:id="56"/>
+      <w:bookmarkEnd w:id="56"/>
       <w:r>
         <w:rPr>
           <w:b w:val="0"/>
@@ -9905,7 +10066,7 @@
         <w:widowControl w:val="0"/>
         <w:numPr>
           <w:ilvl w:val="0"/>
-          <w:numId w:val="25"/>
+          <w:numId w:val="26"/>
         </w:numPr>
         <w:pBdr>
           <w:top w:space="0" w:sz="0" w:val="nil"/>
@@ -9918,8 +10079,8 @@
         <w:ind w:left="720" w:hanging="360"/>
         <w:rPr/>
       </w:pPr>
-      <w:bookmarkStart w:colFirst="0" w:colLast="0" w:name="_161vmjht87fy" w:id="55"/>
-      <w:bookmarkEnd w:id="55"/>
+      <w:bookmarkStart w:colFirst="0" w:colLast="0" w:name="_161vmjht87fy" w:id="57"/>
+      <w:bookmarkEnd w:id="57"/>
       <w:r>
         <w:rPr>
           <w:rtl w:val="0"/>
@@ -10378,6 +10539,7 @@
               <w:rPr>
                 <w:rtl w:val="0"/>
               </w:rPr>
+              <w:t xml:space="preserve">6.4</w:t>
             </w:r>
           </w:p>
         </w:tc>
@@ -10415,6 +10577,7 @@
               <w:rPr>
                 <w:rtl w:val="0"/>
               </w:rPr>
+              <w:t xml:space="preserve">Sara Orion</w:t>
             </w:r>
           </w:p>
         </w:tc>
@@ -10452,6 +10615,7 @@
               <w:rPr>
                 <w:rtl w:val="0"/>
               </w:rPr>
+              <w:t xml:space="preserve">60%</w:t>
             </w:r>
           </w:p>
         </w:tc>
@@ -10489,6 +10653,7 @@
               <w:rPr>
                 <w:rtl w:val="0"/>
               </w:rPr>
+              <w:t xml:space="preserve">Updated Backend/Frontend Testing overviews based on actual testing code files.</w:t>
             </w:r>
           </w:p>
         </w:tc>
@@ -10526,6 +10691,7 @@
               <w:rPr>
                 <w:rtl w:val="0"/>
               </w:rPr>
+              <w:t xml:space="preserve">Sara Orion</w:t>
             </w:r>
           </w:p>
         </w:tc>
@@ -10554,7 +10720,7 @@
         <w:widowControl w:val="0"/>
         <w:numPr>
           <w:ilvl w:val="0"/>
-          <w:numId w:val="25"/>
+          <w:numId w:val="26"/>
         </w:numPr>
         <w:pBdr>
           <w:top w:space="0" w:sz="0" w:val="nil"/>
@@ -10567,8 +10733,8 @@
         <w:ind w:left="720" w:hanging="360"/>
         <w:rPr/>
       </w:pPr>
-      <w:bookmarkStart w:colFirst="0" w:colLast="0" w:name="_7dox6n9hugb0" w:id="56"/>
-      <w:bookmarkEnd w:id="56"/>
+      <w:bookmarkStart w:colFirst="0" w:colLast="0" w:name="_7dox6n9hugb0" w:id="58"/>
+      <w:bookmarkEnd w:id="58"/>
       <w:r>
         <w:rPr>
           <w:rtl w:val="0"/>
@@ -10593,7 +10759,7 @@
         </w:rPr>
         <w:t xml:space="preserve">Github link: </w:t>
       </w:r>
-      <w:hyperlink r:id="rId11">
+      <w:hyperlink r:id="rId9">
         <w:r>
           <w:rPr>
             <w:color w:val="1155cc"/>
@@ -10628,7 +10794,7 @@
         </w:rPr>
         <w:t xml:space="preserve">Project management tool link (GitHub Projects): </w:t>
       </w:r>
-      <w:hyperlink r:id="rId12">
+      <w:hyperlink r:id="rId10">
         <w:r>
           <w:rPr>
             <w:color w:val="1155cc"/>
@@ -10654,7 +10820,7 @@
         <w:widowControl w:val="0"/>
         <w:numPr>
           <w:ilvl w:val="0"/>
-          <w:numId w:val="25"/>
+          <w:numId w:val="26"/>
         </w:numPr>
         <w:pBdr>
           <w:top w:space="0" w:sz="0" w:val="nil"/>
@@ -10668,8 +10834,8 @@
         <w:ind w:left="720" w:hanging="360"/>
         <w:rPr/>
       </w:pPr>
-      <w:bookmarkStart w:colFirst="0" w:colLast="0" w:name="_pd9euov6m4du" w:id="57"/>
-      <w:bookmarkEnd w:id="57"/>
+      <w:bookmarkStart w:colFirst="0" w:colLast="0" w:name="_pd9euov6m4du" w:id="59"/>
+      <w:bookmarkEnd w:id="59"/>
       <w:r>
         <w:rPr>
           <w:rtl w:val="0"/>
@@ -10686,7 +10852,7 @@
         <w:widowControl w:val="0"/>
         <w:numPr>
           <w:ilvl w:val="0"/>
-          <w:numId w:val="25"/>
+          <w:numId w:val="26"/>
         </w:numPr>
         <w:pBdr>
           <w:top w:space="0" w:sz="0" w:val="nil"/>
@@ -10700,8 +10866,8 @@
         <w:ind w:left="720" w:hanging="360"/>
         <w:rPr/>
       </w:pPr>
-      <w:bookmarkStart w:colFirst="0" w:colLast="0" w:name="_ty3i2nqffhtc" w:id="58"/>
-      <w:bookmarkEnd w:id="58"/>
+      <w:bookmarkStart w:colFirst="0" w:colLast="0" w:name="_ty3i2nqffhtc" w:id="60"/>
+      <w:bookmarkEnd w:id="60"/>
       <w:r>
         <w:rPr>
           <w:rtl w:val="0"/>
@@ -10721,7 +10887,7 @@
       </w:r>
     </w:p>
     <w:sectPr>
-      <w:headerReference r:id="rId13" w:type="default"/>
+      <w:headerReference r:id="rId11" w:type="default"/>
       <w:pgSz w:h="15840" w:w="12240" w:orient="portrait"/>
       <w:pgMar w:bottom="1440" w:top="1440" w:left="1440" w:right="1080" w:header="0" w:footer="720"/>
       <w:pgNumType w:start="1"/>
@@ -12425,103 +12591,103 @@
       <w:lvlText w:val="●"/>
       <w:lvlJc w:val="left"/>
       <w:pPr>
+        <w:ind w:left="1440" w:hanging="360"/>
+      </w:pPr>
+      <w:rPr>
+        <w:u w:val="none"/>
+      </w:rPr>
+    </w:lvl>
+    <w:lvl w:ilvl="1">
+      <w:start w:val="1"/>
+      <w:numFmt w:val="bullet"/>
+      <w:lvlText w:val="○"/>
+      <w:lvlJc w:val="left"/>
+      <w:pPr>
+        <w:ind w:left="2160" w:hanging="360"/>
+      </w:pPr>
+      <w:rPr>
+        <w:u w:val="none"/>
+      </w:rPr>
+    </w:lvl>
+    <w:lvl w:ilvl="2">
+      <w:start w:val="1"/>
+      <w:numFmt w:val="bullet"/>
+      <w:lvlText w:val="■"/>
+      <w:lvlJc w:val="left"/>
+      <w:pPr>
         <w:ind w:left="2880" w:hanging="360"/>
       </w:pPr>
       <w:rPr>
         <w:u w:val="none"/>
       </w:rPr>
     </w:lvl>
-    <w:lvl w:ilvl="1">
+    <w:lvl w:ilvl="3">
+      <w:start w:val="1"/>
+      <w:numFmt w:val="bullet"/>
+      <w:lvlText w:val="●"/>
+      <w:lvlJc w:val="left"/>
+      <w:pPr>
+        <w:ind w:left="3600" w:hanging="360"/>
+      </w:pPr>
+      <w:rPr>
+        <w:u w:val="none"/>
+      </w:rPr>
+    </w:lvl>
+    <w:lvl w:ilvl="4">
       <w:start w:val="1"/>
       <w:numFmt w:val="bullet"/>
       <w:lvlText w:val="○"/>
       <w:lvlJc w:val="left"/>
       <w:pPr>
-        <w:ind w:left="3600" w:hanging="360"/>
-      </w:pPr>
-      <w:rPr>
-        <w:u w:val="none"/>
-      </w:rPr>
-    </w:lvl>
-    <w:lvl w:ilvl="2">
+        <w:ind w:left="4320" w:hanging="360"/>
+      </w:pPr>
+      <w:rPr>
+        <w:u w:val="none"/>
+      </w:rPr>
+    </w:lvl>
+    <w:lvl w:ilvl="5">
       <w:start w:val="1"/>
       <w:numFmt w:val="bullet"/>
       <w:lvlText w:val="■"/>
       <w:lvlJc w:val="left"/>
       <w:pPr>
-        <w:ind w:left="4320" w:hanging="360"/>
-      </w:pPr>
-      <w:rPr>
-        <w:u w:val="none"/>
-      </w:rPr>
-    </w:lvl>
-    <w:lvl w:ilvl="3">
+        <w:ind w:left="5040" w:hanging="360"/>
+      </w:pPr>
+      <w:rPr>
+        <w:u w:val="none"/>
+      </w:rPr>
+    </w:lvl>
+    <w:lvl w:ilvl="6">
       <w:start w:val="1"/>
       <w:numFmt w:val="bullet"/>
       <w:lvlText w:val="●"/>
       <w:lvlJc w:val="left"/>
       <w:pPr>
-        <w:ind w:left="5040" w:hanging="360"/>
-      </w:pPr>
-      <w:rPr>
-        <w:u w:val="none"/>
-      </w:rPr>
-    </w:lvl>
-    <w:lvl w:ilvl="4">
+        <w:ind w:left="5760" w:hanging="360"/>
+      </w:pPr>
+      <w:rPr>
+        <w:u w:val="none"/>
+      </w:rPr>
+    </w:lvl>
+    <w:lvl w:ilvl="7">
       <w:start w:val="1"/>
       <w:numFmt w:val="bullet"/>
       <w:lvlText w:val="○"/>
       <w:lvlJc w:val="left"/>
       <w:pPr>
-        <w:ind w:left="5760" w:hanging="360"/>
-      </w:pPr>
-      <w:rPr>
-        <w:u w:val="none"/>
-      </w:rPr>
-    </w:lvl>
-    <w:lvl w:ilvl="5">
+        <w:ind w:left="6480" w:hanging="360"/>
+      </w:pPr>
+      <w:rPr>
+        <w:u w:val="none"/>
+      </w:rPr>
+    </w:lvl>
+    <w:lvl w:ilvl="8">
       <w:start w:val="1"/>
       <w:numFmt w:val="bullet"/>
       <w:lvlText w:val="■"/>
       <w:lvlJc w:val="left"/>
       <w:pPr>
-        <w:ind w:left="6480" w:hanging="360"/>
-      </w:pPr>
-      <w:rPr>
-        <w:u w:val="none"/>
-      </w:rPr>
-    </w:lvl>
-    <w:lvl w:ilvl="6">
-      <w:start w:val="1"/>
-      <w:numFmt w:val="bullet"/>
-      <w:lvlText w:val="●"/>
-      <w:lvlJc w:val="left"/>
-      <w:pPr>
         <w:ind w:left="7200" w:hanging="360"/>
-      </w:pPr>
-      <w:rPr>
-        <w:u w:val="none"/>
-      </w:rPr>
-    </w:lvl>
-    <w:lvl w:ilvl="7">
-      <w:start w:val="1"/>
-      <w:numFmt w:val="bullet"/>
-      <w:lvlText w:val="○"/>
-      <w:lvlJc w:val="left"/>
-      <w:pPr>
-        <w:ind w:left="7920" w:hanging="360"/>
-      </w:pPr>
-      <w:rPr>
-        <w:u w:val="none"/>
-      </w:rPr>
-    </w:lvl>
-    <w:lvl w:ilvl="8">
-      <w:start w:val="1"/>
-      <w:numFmt w:val="bullet"/>
-      <w:lvlText w:val="■"/>
-      <w:lvlJc w:val="left"/>
-      <w:pPr>
-        <w:ind w:left="8640" w:hanging="360"/>
       </w:pPr>
       <w:rPr>
         <w:u w:val="none"/>
@@ -12535,7 +12701,7 @@
       <w:lvlText w:val="●"/>
       <w:lvlJc w:val="left"/>
       <w:pPr>
-        <w:ind w:left="1440" w:hanging="360"/>
+        <w:ind w:left="2880" w:hanging="360"/>
       </w:pPr>
       <w:rPr>
         <w:u w:val="none"/>
@@ -12547,7 +12713,7 @@
       <w:lvlText w:val="○"/>
       <w:lvlJc w:val="left"/>
       <w:pPr>
-        <w:ind w:left="2160" w:hanging="360"/>
+        <w:ind w:left="3600" w:hanging="360"/>
       </w:pPr>
       <w:rPr>
         <w:u w:val="none"/>
@@ -12559,7 +12725,7 @@
       <w:lvlText w:val="■"/>
       <w:lvlJc w:val="left"/>
       <w:pPr>
-        <w:ind w:left="2880" w:hanging="360"/>
+        <w:ind w:left="4320" w:hanging="360"/>
       </w:pPr>
       <w:rPr>
         <w:u w:val="none"/>
@@ -12571,7 +12737,7 @@
       <w:lvlText w:val="●"/>
       <w:lvlJc w:val="left"/>
       <w:pPr>
-        <w:ind w:left="3600" w:hanging="360"/>
+        <w:ind w:left="5040" w:hanging="360"/>
       </w:pPr>
       <w:rPr>
         <w:u w:val="none"/>
@@ -12583,7 +12749,7 @@
       <w:lvlText w:val="○"/>
       <w:lvlJc w:val="left"/>
       <w:pPr>
-        <w:ind w:left="4320" w:hanging="360"/>
+        <w:ind w:left="5760" w:hanging="360"/>
       </w:pPr>
       <w:rPr>
         <w:u w:val="none"/>
@@ -12595,7 +12761,7 @@
       <w:lvlText w:val="■"/>
       <w:lvlJc w:val="left"/>
       <w:pPr>
-        <w:ind w:left="5040" w:hanging="360"/>
+        <w:ind w:left="6480" w:hanging="360"/>
       </w:pPr>
       <w:rPr>
         <w:u w:val="none"/>
@@ -12607,7 +12773,7 @@
       <w:lvlText w:val="●"/>
       <w:lvlJc w:val="left"/>
       <w:pPr>
-        <w:ind w:left="5760" w:hanging="360"/>
+        <w:ind w:left="7200" w:hanging="360"/>
       </w:pPr>
       <w:rPr>
         <w:u w:val="none"/>
@@ -12619,7 +12785,7 @@
       <w:lvlText w:val="○"/>
       <w:lvlJc w:val="left"/>
       <w:pPr>
-        <w:ind w:left="6480" w:hanging="360"/>
+        <w:ind w:left="7920" w:hanging="360"/>
       </w:pPr>
       <w:rPr>
         <w:u w:val="none"/>
@@ -12631,7 +12797,7 @@
       <w:lvlText w:val="■"/>
       <w:lvlJc w:val="left"/>
       <w:pPr>
-        <w:ind w:left="7200" w:hanging="360"/>
+        <w:ind w:left="8640" w:hanging="360"/>
       </w:pPr>
       <w:rPr>
         <w:u w:val="none"/>
@@ -12865,10 +13031,9 @@
       <w:lvlText w:val="●"/>
       <w:lvlJc w:val="left"/>
       <w:pPr>
-        <w:ind w:left="720" w:hanging="360"/>
-      </w:pPr>
-      <w:rPr>
-        <w:rFonts w:ascii="Arial" w:cs="Arial" w:eastAsia="Arial" w:hAnsi="Arial"/>
+        <w:ind w:left="1440" w:hanging="360"/>
+      </w:pPr>
+      <w:rPr>
         <w:u w:val="none"/>
       </w:rPr>
     </w:lvl>
@@ -12878,7 +13043,7 @@
       <w:lvlText w:val="○"/>
       <w:lvlJc w:val="left"/>
       <w:pPr>
-        <w:ind w:left="1440" w:hanging="360"/>
+        <w:ind w:left="2160" w:hanging="360"/>
       </w:pPr>
       <w:rPr>
         <w:u w:val="none"/>
@@ -12890,7 +13055,7 @@
       <w:lvlText w:val="■"/>
       <w:lvlJc w:val="left"/>
       <w:pPr>
-        <w:ind w:left="2160" w:hanging="360"/>
+        <w:ind w:left="2880" w:hanging="360"/>
       </w:pPr>
       <w:rPr>
         <w:u w:val="none"/>
@@ -12902,7 +13067,7 @@
       <w:lvlText w:val="●"/>
       <w:lvlJc w:val="left"/>
       <w:pPr>
-        <w:ind w:left="2880" w:hanging="360"/>
+        <w:ind w:left="3600" w:hanging="360"/>
       </w:pPr>
       <w:rPr>
         <w:u w:val="none"/>
@@ -12914,7 +13079,7 @@
       <w:lvlText w:val="○"/>
       <w:lvlJc w:val="left"/>
       <w:pPr>
-        <w:ind w:left="3600" w:hanging="360"/>
+        <w:ind w:left="4320" w:hanging="360"/>
       </w:pPr>
       <w:rPr>
         <w:u w:val="none"/>
@@ -12926,7 +13091,7 @@
       <w:lvlText w:val="■"/>
       <w:lvlJc w:val="left"/>
       <w:pPr>
-        <w:ind w:left="4320" w:hanging="360"/>
+        <w:ind w:left="5040" w:hanging="360"/>
       </w:pPr>
       <w:rPr>
         <w:u w:val="none"/>
@@ -12938,7 +13103,7 @@
       <w:lvlText w:val="●"/>
       <w:lvlJc w:val="left"/>
       <w:pPr>
-        <w:ind w:left="5040" w:hanging="360"/>
+        <w:ind w:left="5760" w:hanging="360"/>
       </w:pPr>
       <w:rPr>
         <w:u w:val="none"/>
@@ -12950,7 +13115,7 @@
       <w:lvlText w:val="○"/>
       <w:lvlJc w:val="left"/>
       <w:pPr>
-        <w:ind w:left="5760" w:hanging="360"/>
+        <w:ind w:left="6480" w:hanging="360"/>
       </w:pPr>
       <w:rPr>
         <w:u w:val="none"/>
@@ -12962,7 +13127,7 @@
       <w:lvlText w:val="■"/>
       <w:lvlJc w:val="left"/>
       <w:pPr>
-        <w:ind w:left="6480" w:hanging="360"/>
+        <w:ind w:left="7200" w:hanging="360"/>
       </w:pPr>
       <w:rPr>
         <w:u w:val="none"/>
@@ -12976,103 +13141,104 @@
       <w:lvlText w:val="●"/>
       <w:lvlJc w:val="left"/>
       <w:pPr>
+        <w:ind w:left="720" w:hanging="360"/>
+      </w:pPr>
+      <w:rPr>
+        <w:rFonts w:ascii="Arial" w:cs="Arial" w:eastAsia="Arial" w:hAnsi="Arial"/>
+        <w:u w:val="none"/>
+      </w:rPr>
+    </w:lvl>
+    <w:lvl w:ilvl="1">
+      <w:start w:val="1"/>
+      <w:numFmt w:val="bullet"/>
+      <w:lvlText w:val="○"/>
+      <w:lvlJc w:val="left"/>
+      <w:pPr>
         <w:ind w:left="1440" w:hanging="360"/>
       </w:pPr>
       <w:rPr>
         <w:u w:val="none"/>
       </w:rPr>
     </w:lvl>
-    <w:lvl w:ilvl="1">
+    <w:lvl w:ilvl="2">
+      <w:start w:val="1"/>
+      <w:numFmt w:val="bullet"/>
+      <w:lvlText w:val="■"/>
+      <w:lvlJc w:val="left"/>
+      <w:pPr>
+        <w:ind w:left="2160" w:hanging="360"/>
+      </w:pPr>
+      <w:rPr>
+        <w:u w:val="none"/>
+      </w:rPr>
+    </w:lvl>
+    <w:lvl w:ilvl="3">
+      <w:start w:val="1"/>
+      <w:numFmt w:val="bullet"/>
+      <w:lvlText w:val="●"/>
+      <w:lvlJc w:val="left"/>
+      <w:pPr>
+        <w:ind w:left="2880" w:hanging="360"/>
+      </w:pPr>
+      <w:rPr>
+        <w:u w:val="none"/>
+      </w:rPr>
+    </w:lvl>
+    <w:lvl w:ilvl="4">
       <w:start w:val="1"/>
       <w:numFmt w:val="bullet"/>
       <w:lvlText w:val="○"/>
       <w:lvlJc w:val="left"/>
       <w:pPr>
-        <w:ind w:left="2160" w:hanging="360"/>
-      </w:pPr>
-      <w:rPr>
-        <w:u w:val="none"/>
-      </w:rPr>
-    </w:lvl>
-    <w:lvl w:ilvl="2">
+        <w:ind w:left="3600" w:hanging="360"/>
+      </w:pPr>
+      <w:rPr>
+        <w:u w:val="none"/>
+      </w:rPr>
+    </w:lvl>
+    <w:lvl w:ilvl="5">
       <w:start w:val="1"/>
       <w:numFmt w:val="bullet"/>
       <w:lvlText w:val="■"/>
       <w:lvlJc w:val="left"/>
       <w:pPr>
-        <w:ind w:left="2880" w:hanging="360"/>
-      </w:pPr>
-      <w:rPr>
-        <w:u w:val="none"/>
-      </w:rPr>
-    </w:lvl>
-    <w:lvl w:ilvl="3">
+        <w:ind w:left="4320" w:hanging="360"/>
+      </w:pPr>
+      <w:rPr>
+        <w:u w:val="none"/>
+      </w:rPr>
+    </w:lvl>
+    <w:lvl w:ilvl="6">
       <w:start w:val="1"/>
       <w:numFmt w:val="bullet"/>
       <w:lvlText w:val="●"/>
       <w:lvlJc w:val="left"/>
       <w:pPr>
-        <w:ind w:left="3600" w:hanging="360"/>
-      </w:pPr>
-      <w:rPr>
-        <w:u w:val="none"/>
-      </w:rPr>
-    </w:lvl>
-    <w:lvl w:ilvl="4">
+        <w:ind w:left="5040" w:hanging="360"/>
+      </w:pPr>
+      <w:rPr>
+        <w:u w:val="none"/>
+      </w:rPr>
+    </w:lvl>
+    <w:lvl w:ilvl="7">
       <w:start w:val="1"/>
       <w:numFmt w:val="bullet"/>
       <w:lvlText w:val="○"/>
       <w:lvlJc w:val="left"/>
       <w:pPr>
-        <w:ind w:left="4320" w:hanging="360"/>
-      </w:pPr>
-      <w:rPr>
-        <w:u w:val="none"/>
-      </w:rPr>
-    </w:lvl>
-    <w:lvl w:ilvl="5">
+        <w:ind w:left="5760" w:hanging="360"/>
+      </w:pPr>
+      <w:rPr>
+        <w:u w:val="none"/>
+      </w:rPr>
+    </w:lvl>
+    <w:lvl w:ilvl="8">
       <w:start w:val="1"/>
       <w:numFmt w:val="bullet"/>
       <w:lvlText w:val="■"/>
       <w:lvlJc w:val="left"/>
       <w:pPr>
-        <w:ind w:left="5040" w:hanging="360"/>
-      </w:pPr>
-      <w:rPr>
-        <w:u w:val="none"/>
-      </w:rPr>
-    </w:lvl>
-    <w:lvl w:ilvl="6">
-      <w:start w:val="1"/>
-      <w:numFmt w:val="bullet"/>
-      <w:lvlText w:val="●"/>
-      <w:lvlJc w:val="left"/>
-      <w:pPr>
-        <w:ind w:left="5760" w:hanging="360"/>
-      </w:pPr>
-      <w:rPr>
-        <w:u w:val="none"/>
-      </w:rPr>
-    </w:lvl>
-    <w:lvl w:ilvl="7">
-      <w:start w:val="1"/>
-      <w:numFmt w:val="bullet"/>
-      <w:lvlText w:val="○"/>
-      <w:lvlJc w:val="left"/>
-      <w:pPr>
         <w:ind w:left="6480" w:hanging="360"/>
-      </w:pPr>
-      <w:rPr>
-        <w:u w:val="none"/>
-      </w:rPr>
-    </w:lvl>
-    <w:lvl w:ilvl="8">
-      <w:start w:val="1"/>
-      <w:numFmt w:val="bullet"/>
-      <w:lvlText w:val="■"/>
-      <w:lvlJc w:val="left"/>
-      <w:pPr>
-        <w:ind w:left="7200" w:hanging="360"/>
       </w:pPr>
       <w:rPr>
         <w:u w:val="none"/>
@@ -13086,103 +13252,103 @@
       <w:lvlText w:val="●"/>
       <w:lvlJc w:val="left"/>
       <w:pPr>
+        <w:ind w:left="1440" w:hanging="360"/>
+      </w:pPr>
+      <w:rPr>
+        <w:u w:val="none"/>
+      </w:rPr>
+    </w:lvl>
+    <w:lvl w:ilvl="1">
+      <w:start w:val="1"/>
+      <w:numFmt w:val="bullet"/>
+      <w:lvlText w:val="○"/>
+      <w:lvlJc w:val="left"/>
+      <w:pPr>
+        <w:ind w:left="2160" w:hanging="360"/>
+      </w:pPr>
+      <w:rPr>
+        <w:u w:val="none"/>
+      </w:rPr>
+    </w:lvl>
+    <w:lvl w:ilvl="2">
+      <w:start w:val="1"/>
+      <w:numFmt w:val="bullet"/>
+      <w:lvlText w:val="■"/>
+      <w:lvlJc w:val="left"/>
+      <w:pPr>
         <w:ind w:left="2880" w:hanging="360"/>
       </w:pPr>
       <w:rPr>
         <w:u w:val="none"/>
       </w:rPr>
     </w:lvl>
-    <w:lvl w:ilvl="1">
+    <w:lvl w:ilvl="3">
+      <w:start w:val="1"/>
+      <w:numFmt w:val="bullet"/>
+      <w:lvlText w:val="●"/>
+      <w:lvlJc w:val="left"/>
+      <w:pPr>
+        <w:ind w:left="3600" w:hanging="360"/>
+      </w:pPr>
+      <w:rPr>
+        <w:u w:val="none"/>
+      </w:rPr>
+    </w:lvl>
+    <w:lvl w:ilvl="4">
       <w:start w:val="1"/>
       <w:numFmt w:val="bullet"/>
       <w:lvlText w:val="○"/>
       <w:lvlJc w:val="left"/>
       <w:pPr>
-        <w:ind w:left="3600" w:hanging="360"/>
-      </w:pPr>
-      <w:rPr>
-        <w:u w:val="none"/>
-      </w:rPr>
-    </w:lvl>
-    <w:lvl w:ilvl="2">
+        <w:ind w:left="4320" w:hanging="360"/>
+      </w:pPr>
+      <w:rPr>
+        <w:u w:val="none"/>
+      </w:rPr>
+    </w:lvl>
+    <w:lvl w:ilvl="5">
       <w:start w:val="1"/>
       <w:numFmt w:val="bullet"/>
       <w:lvlText w:val="■"/>
       <w:lvlJc w:val="left"/>
       <w:pPr>
-        <w:ind w:left="4320" w:hanging="360"/>
-      </w:pPr>
-      <w:rPr>
-        <w:u w:val="none"/>
-      </w:rPr>
-    </w:lvl>
-    <w:lvl w:ilvl="3">
+        <w:ind w:left="5040" w:hanging="360"/>
+      </w:pPr>
+      <w:rPr>
+        <w:u w:val="none"/>
+      </w:rPr>
+    </w:lvl>
+    <w:lvl w:ilvl="6">
       <w:start w:val="1"/>
       <w:numFmt w:val="bullet"/>
       <w:lvlText w:val="●"/>
       <w:lvlJc w:val="left"/>
       <w:pPr>
-        <w:ind w:left="5040" w:hanging="360"/>
-      </w:pPr>
-      <w:rPr>
-        <w:u w:val="none"/>
-      </w:rPr>
-    </w:lvl>
-    <w:lvl w:ilvl="4">
+        <w:ind w:left="5760" w:hanging="360"/>
+      </w:pPr>
+      <w:rPr>
+        <w:u w:val="none"/>
+      </w:rPr>
+    </w:lvl>
+    <w:lvl w:ilvl="7">
       <w:start w:val="1"/>
       <w:numFmt w:val="bullet"/>
       <w:lvlText w:val="○"/>
       <w:lvlJc w:val="left"/>
       <w:pPr>
-        <w:ind w:left="5760" w:hanging="360"/>
-      </w:pPr>
-      <w:rPr>
-        <w:u w:val="none"/>
-      </w:rPr>
-    </w:lvl>
-    <w:lvl w:ilvl="5">
+        <w:ind w:left="6480" w:hanging="360"/>
+      </w:pPr>
+      <w:rPr>
+        <w:u w:val="none"/>
+      </w:rPr>
+    </w:lvl>
+    <w:lvl w:ilvl="8">
       <w:start w:val="1"/>
       <w:numFmt w:val="bullet"/>
       <w:lvlText w:val="■"/>
       <w:lvlJc w:val="left"/>
       <w:pPr>
-        <w:ind w:left="6480" w:hanging="360"/>
-      </w:pPr>
-      <w:rPr>
-        <w:u w:val="none"/>
-      </w:rPr>
-    </w:lvl>
-    <w:lvl w:ilvl="6">
-      <w:start w:val="1"/>
-      <w:numFmt w:val="bullet"/>
-      <w:lvlText w:val="●"/>
-      <w:lvlJc w:val="left"/>
-      <w:pPr>
         <w:ind w:left="7200" w:hanging="360"/>
-      </w:pPr>
-      <w:rPr>
-        <w:u w:val="none"/>
-      </w:rPr>
-    </w:lvl>
-    <w:lvl w:ilvl="7">
-      <w:start w:val="1"/>
-      <w:numFmt w:val="bullet"/>
-      <w:lvlText w:val="○"/>
-      <w:lvlJc w:val="left"/>
-      <w:pPr>
-        <w:ind w:left="7920" w:hanging="360"/>
-      </w:pPr>
-      <w:rPr>
-        <w:u w:val="none"/>
-      </w:rPr>
-    </w:lvl>
-    <w:lvl w:ilvl="8">
-      <w:start w:val="1"/>
-      <w:numFmt w:val="bullet"/>
-      <w:lvlText w:val="■"/>
-      <w:lvlJc w:val="left"/>
-      <w:pPr>
-        <w:ind w:left="8640" w:hanging="360"/>
       </w:pPr>
       <w:rPr>
         <w:u w:val="none"/>
@@ -13196,7 +13362,7 @@
       <w:lvlText w:val="●"/>
       <w:lvlJc w:val="left"/>
       <w:pPr>
-        <w:ind w:left="1440" w:hanging="360"/>
+        <w:ind w:left="2880" w:hanging="360"/>
       </w:pPr>
       <w:rPr>
         <w:u w:val="none"/>
@@ -13208,7 +13374,7 @@
       <w:lvlText w:val="○"/>
       <w:lvlJc w:val="left"/>
       <w:pPr>
-        <w:ind w:left="2160" w:hanging="360"/>
+        <w:ind w:left="3600" w:hanging="360"/>
       </w:pPr>
       <w:rPr>
         <w:u w:val="none"/>
@@ -13220,7 +13386,7 @@
       <w:lvlText w:val="■"/>
       <w:lvlJc w:val="left"/>
       <w:pPr>
-        <w:ind w:left="2880" w:hanging="360"/>
+        <w:ind w:left="4320" w:hanging="360"/>
       </w:pPr>
       <w:rPr>
         <w:u w:val="none"/>
@@ -13232,7 +13398,7 @@
       <w:lvlText w:val="●"/>
       <w:lvlJc w:val="left"/>
       <w:pPr>
-        <w:ind w:left="3600" w:hanging="360"/>
+        <w:ind w:left="5040" w:hanging="360"/>
       </w:pPr>
       <w:rPr>
         <w:u w:val="none"/>
@@ -13244,7 +13410,7 @@
       <w:lvlText w:val="○"/>
       <w:lvlJc w:val="left"/>
       <w:pPr>
-        <w:ind w:left="4320" w:hanging="360"/>
+        <w:ind w:left="5760" w:hanging="360"/>
       </w:pPr>
       <w:rPr>
         <w:u w:val="none"/>
@@ -13256,7 +13422,7 @@
       <w:lvlText w:val="■"/>
       <w:lvlJc w:val="left"/>
       <w:pPr>
-        <w:ind w:left="5040" w:hanging="360"/>
+        <w:ind w:left="6480" w:hanging="360"/>
       </w:pPr>
       <w:rPr>
         <w:u w:val="none"/>
@@ -13268,7 +13434,7 @@
       <w:lvlText w:val="●"/>
       <w:lvlJc w:val="left"/>
       <w:pPr>
-        <w:ind w:left="5760" w:hanging="360"/>
+        <w:ind w:left="7200" w:hanging="360"/>
       </w:pPr>
       <w:rPr>
         <w:u w:val="none"/>
@@ -13280,7 +13446,7 @@
       <w:lvlText w:val="○"/>
       <w:lvlJc w:val="left"/>
       <w:pPr>
-        <w:ind w:left="6480" w:hanging="360"/>
+        <w:ind w:left="7920" w:hanging="360"/>
       </w:pPr>
       <w:rPr>
         <w:u w:val="none"/>
@@ -13292,7 +13458,7 @@
       <w:lvlText w:val="■"/>
       <w:lvlJc w:val="left"/>
       <w:pPr>
-        <w:ind w:left="7200" w:hanging="360"/>
+        <w:ind w:left="8640" w:hanging="360"/>
       </w:pPr>
       <w:rPr>
         <w:u w:val="none"/>
@@ -13412,11 +13578,11 @@
   <w:abstractNum w:abstractNumId="25">
     <w:lvl w:ilvl="0">
       <w:start w:val="1"/>
-      <w:numFmt w:val="decimal"/>
-      <w:lvlText w:val="%1."/>
-      <w:lvlJc w:val="left"/>
-      <w:pPr>
-        <w:ind w:left="720" w:hanging="360"/>
+      <w:numFmt w:val="bullet"/>
+      <w:lvlText w:val="●"/>
+      <w:lvlJc w:val="left"/>
+      <w:pPr>
+        <w:ind w:left="1440" w:hanging="360"/>
       </w:pPr>
       <w:rPr>
         <w:u w:val="none"/>
@@ -13424,11 +13590,11 @@
     </w:lvl>
     <w:lvl w:ilvl="1">
       <w:start w:val="1"/>
-      <w:numFmt w:val="lowerLetter"/>
-      <w:lvlText w:val="%2."/>
-      <w:lvlJc w:val="left"/>
-      <w:pPr>
-        <w:ind w:left="1440" w:hanging="360"/>
+      <w:numFmt w:val="bullet"/>
+      <w:lvlText w:val="○"/>
+      <w:lvlJc w:val="left"/>
+      <w:pPr>
+        <w:ind w:left="2160" w:hanging="360"/>
       </w:pPr>
       <w:rPr>
         <w:u w:val="none"/>
@@ -13436,11 +13602,11 @@
     </w:lvl>
     <w:lvl w:ilvl="2">
       <w:start w:val="1"/>
-      <w:numFmt w:val="lowerRoman"/>
-      <w:lvlText w:val="%3."/>
-      <w:lvlJc w:val="left"/>
-      <w:pPr>
-        <w:ind w:left="2160" w:hanging="360"/>
+      <w:numFmt w:val="bullet"/>
+      <w:lvlText w:val="■"/>
+      <w:lvlJc w:val="left"/>
+      <w:pPr>
+        <w:ind w:left="2880" w:hanging="360"/>
       </w:pPr>
       <w:rPr>
         <w:u w:val="none"/>
@@ -13448,11 +13614,11 @@
     </w:lvl>
     <w:lvl w:ilvl="3">
       <w:start w:val="1"/>
-      <w:numFmt w:val="decimal"/>
-      <w:lvlText w:val="%4."/>
-      <w:lvlJc w:val="left"/>
-      <w:pPr>
-        <w:ind w:left="2880" w:hanging="360"/>
+      <w:numFmt w:val="bullet"/>
+      <w:lvlText w:val="●"/>
+      <w:lvlJc w:val="left"/>
+      <w:pPr>
+        <w:ind w:left="3600" w:hanging="360"/>
       </w:pPr>
       <w:rPr>
         <w:u w:val="none"/>
@@ -13460,11 +13626,11 @@
     </w:lvl>
     <w:lvl w:ilvl="4">
       <w:start w:val="1"/>
-      <w:numFmt w:val="lowerLetter"/>
-      <w:lvlText w:val="%5."/>
-      <w:lvlJc w:val="left"/>
-      <w:pPr>
-        <w:ind w:left="3600" w:hanging="360"/>
+      <w:numFmt w:val="bullet"/>
+      <w:lvlText w:val="○"/>
+      <w:lvlJc w:val="left"/>
+      <w:pPr>
+        <w:ind w:left="4320" w:hanging="360"/>
       </w:pPr>
       <w:rPr>
         <w:u w:val="none"/>
@@ -13472,11 +13638,11 @@
     </w:lvl>
     <w:lvl w:ilvl="5">
       <w:start w:val="1"/>
-      <w:numFmt w:val="lowerRoman"/>
-      <w:lvlText w:val="%6."/>
-      <w:lvlJc w:val="left"/>
-      <w:pPr>
-        <w:ind w:left="4320" w:hanging="360"/>
+      <w:numFmt w:val="bullet"/>
+      <w:lvlText w:val="■"/>
+      <w:lvlJc w:val="left"/>
+      <w:pPr>
+        <w:ind w:left="5040" w:hanging="360"/>
       </w:pPr>
       <w:rPr>
         <w:u w:val="none"/>
@@ -13484,11 +13650,11 @@
     </w:lvl>
     <w:lvl w:ilvl="6">
       <w:start w:val="1"/>
-      <w:numFmt w:val="decimal"/>
-      <w:lvlText w:val="%7."/>
-      <w:lvlJc w:val="left"/>
-      <w:pPr>
-        <w:ind w:left="5040" w:hanging="360"/>
+      <w:numFmt w:val="bullet"/>
+      <w:lvlText w:val="●"/>
+      <w:lvlJc w:val="left"/>
+      <w:pPr>
+        <w:ind w:left="5760" w:hanging="360"/>
       </w:pPr>
       <w:rPr>
         <w:u w:val="none"/>
@@ -13496,11 +13662,11 @@
     </w:lvl>
     <w:lvl w:ilvl="7">
       <w:start w:val="1"/>
-      <w:numFmt w:val="lowerLetter"/>
-      <w:lvlText w:val="%8."/>
-      <w:lvlJc w:val="left"/>
-      <w:pPr>
-        <w:ind w:left="5760" w:hanging="360"/>
+      <w:numFmt w:val="bullet"/>
+      <w:lvlText w:val="○"/>
+      <w:lvlJc w:val="left"/>
+      <w:pPr>
+        <w:ind w:left="6480" w:hanging="360"/>
       </w:pPr>
       <w:rPr>
         <w:u w:val="none"/>
@@ -13508,11 +13674,11 @@
     </w:lvl>
     <w:lvl w:ilvl="8">
       <w:start w:val="1"/>
-      <w:numFmt w:val="lowerRoman"/>
-      <w:lvlText w:val="%9."/>
-      <w:lvlJc w:val="left"/>
-      <w:pPr>
-        <w:ind w:left="6480" w:hanging="360"/>
+      <w:numFmt w:val="bullet"/>
+      <w:lvlText w:val="■"/>
+      <w:lvlJc w:val="left"/>
+      <w:pPr>
+        <w:ind w:left="7200" w:hanging="360"/>
       </w:pPr>
       <w:rPr>
         <w:u w:val="none"/>
@@ -13522,8 +13688,20 @@
   <w:abstractNum w:abstractNumId="26">
     <w:lvl w:ilvl="0">
       <w:start w:val="1"/>
-      <w:numFmt w:val="bullet"/>
-      <w:lvlText w:val="●"/>
+      <w:numFmt w:val="decimal"/>
+      <w:lvlText w:val="%1."/>
+      <w:lvlJc w:val="left"/>
+      <w:pPr>
+        <w:ind w:left="720" w:hanging="360"/>
+      </w:pPr>
+      <w:rPr>
+        <w:u w:val="none"/>
+      </w:rPr>
+    </w:lvl>
+    <w:lvl w:ilvl="1">
+      <w:start w:val="1"/>
+      <w:numFmt w:val="lowerLetter"/>
+      <w:lvlText w:val="%2."/>
       <w:lvlJc w:val="left"/>
       <w:pPr>
         <w:ind w:left="1440" w:hanging="360"/>
@@ -13532,10 +13710,10 @@
         <w:u w:val="none"/>
       </w:rPr>
     </w:lvl>
-    <w:lvl w:ilvl="1">
-      <w:start w:val="1"/>
-      <w:numFmt w:val="bullet"/>
-      <w:lvlText w:val="○"/>
+    <w:lvl w:ilvl="2">
+      <w:start w:val="1"/>
+      <w:numFmt w:val="lowerRoman"/>
+      <w:lvlText w:val="%3."/>
       <w:lvlJc w:val="left"/>
       <w:pPr>
         <w:ind w:left="2160" w:hanging="360"/>
@@ -13544,10 +13722,10 @@
         <w:u w:val="none"/>
       </w:rPr>
     </w:lvl>
-    <w:lvl w:ilvl="2">
-      <w:start w:val="1"/>
-      <w:numFmt w:val="bullet"/>
-      <w:lvlText w:val="■"/>
+    <w:lvl w:ilvl="3">
+      <w:start w:val="1"/>
+      <w:numFmt w:val="decimal"/>
+      <w:lvlText w:val="%4."/>
       <w:lvlJc w:val="left"/>
       <w:pPr>
         <w:ind w:left="2880" w:hanging="360"/>
@@ -13556,10 +13734,10 @@
         <w:u w:val="none"/>
       </w:rPr>
     </w:lvl>
-    <w:lvl w:ilvl="3">
-      <w:start w:val="1"/>
-      <w:numFmt w:val="bullet"/>
-      <w:lvlText w:val="●"/>
+    <w:lvl w:ilvl="4">
+      <w:start w:val="1"/>
+      <w:numFmt w:val="lowerLetter"/>
+      <w:lvlText w:val="%5."/>
       <w:lvlJc w:val="left"/>
       <w:pPr>
         <w:ind w:left="3600" w:hanging="360"/>
@@ -13568,10 +13746,10 @@
         <w:u w:val="none"/>
       </w:rPr>
     </w:lvl>
-    <w:lvl w:ilvl="4">
-      <w:start w:val="1"/>
-      <w:numFmt w:val="bullet"/>
-      <w:lvlText w:val="○"/>
+    <w:lvl w:ilvl="5">
+      <w:start w:val="1"/>
+      <w:numFmt w:val="lowerRoman"/>
+      <w:lvlText w:val="%6."/>
       <w:lvlJc w:val="left"/>
       <w:pPr>
         <w:ind w:left="4320" w:hanging="360"/>
@@ -13580,10 +13758,10 @@
         <w:u w:val="none"/>
       </w:rPr>
     </w:lvl>
-    <w:lvl w:ilvl="5">
-      <w:start w:val="1"/>
-      <w:numFmt w:val="bullet"/>
-      <w:lvlText w:val="■"/>
+    <w:lvl w:ilvl="6">
+      <w:start w:val="1"/>
+      <w:numFmt w:val="decimal"/>
+      <w:lvlText w:val="%7."/>
       <w:lvlJc w:val="left"/>
       <w:pPr>
         <w:ind w:left="5040" w:hanging="360"/>
@@ -13592,10 +13770,10 @@
         <w:u w:val="none"/>
       </w:rPr>
     </w:lvl>
-    <w:lvl w:ilvl="6">
-      <w:start w:val="1"/>
-      <w:numFmt w:val="bullet"/>
-      <w:lvlText w:val="●"/>
+    <w:lvl w:ilvl="7">
+      <w:start w:val="1"/>
+      <w:numFmt w:val="lowerLetter"/>
+      <w:lvlText w:val="%8."/>
       <w:lvlJc w:val="left"/>
       <w:pPr>
         <w:ind w:left="5760" w:hanging="360"/>
@@ -13604,25 +13782,13 @@
         <w:u w:val="none"/>
       </w:rPr>
     </w:lvl>
-    <w:lvl w:ilvl="7">
-      <w:start w:val="1"/>
-      <w:numFmt w:val="bullet"/>
-      <w:lvlText w:val="○"/>
+    <w:lvl w:ilvl="8">
+      <w:start w:val="1"/>
+      <w:numFmt w:val="lowerRoman"/>
+      <w:lvlText w:val="%9."/>
       <w:lvlJc w:val="left"/>
       <w:pPr>
         <w:ind w:left="6480" w:hanging="360"/>
-      </w:pPr>
-      <w:rPr>
-        <w:u w:val="none"/>
-      </w:rPr>
-    </w:lvl>
-    <w:lvl w:ilvl="8">
-      <w:start w:val="1"/>
-      <w:numFmt w:val="bullet"/>
-      <w:lvlText w:val="■"/>
-      <w:lvlJc w:val="left"/>
-      <w:pPr>
-        <w:ind w:left="7200" w:hanging="360"/>
       </w:pPr>
       <w:rPr>
         <w:u w:val="none"/>
@@ -13746,7 +13912,7 @@
       <w:lvlText w:val="●"/>
       <w:lvlJc w:val="left"/>
       <w:pPr>
-        <w:ind w:left="720" w:hanging="360"/>
+        <w:ind w:left="1440" w:hanging="360"/>
       </w:pPr>
       <w:rPr>
         <w:u w:val="none"/>
@@ -13758,7 +13924,7 @@
       <w:lvlText w:val="○"/>
       <w:lvlJc w:val="left"/>
       <w:pPr>
-        <w:ind w:left="1440" w:hanging="360"/>
+        <w:ind w:left="2160" w:hanging="360"/>
       </w:pPr>
       <w:rPr>
         <w:u w:val="none"/>
@@ -13770,7 +13936,7 @@
       <w:lvlText w:val="■"/>
       <w:lvlJc w:val="left"/>
       <w:pPr>
-        <w:ind w:left="2160" w:hanging="360"/>
+        <w:ind w:left="2880" w:hanging="360"/>
       </w:pPr>
       <w:rPr>
         <w:u w:val="none"/>
@@ -13782,7 +13948,7 @@
       <w:lvlText w:val="●"/>
       <w:lvlJc w:val="left"/>
       <w:pPr>
-        <w:ind w:left="2880" w:hanging="360"/>
+        <w:ind w:left="3600" w:hanging="360"/>
       </w:pPr>
       <w:rPr>
         <w:u w:val="none"/>
@@ -13794,7 +13960,7 @@
       <w:lvlText w:val="○"/>
       <w:lvlJc w:val="left"/>
       <w:pPr>
-        <w:ind w:left="3600" w:hanging="360"/>
+        <w:ind w:left="4320" w:hanging="360"/>
       </w:pPr>
       <w:rPr>
         <w:u w:val="none"/>
@@ -13806,7 +13972,7 @@
       <w:lvlText w:val="■"/>
       <w:lvlJc w:val="left"/>
       <w:pPr>
-        <w:ind w:left="4320" w:hanging="360"/>
+        <w:ind w:left="5040" w:hanging="360"/>
       </w:pPr>
       <w:rPr>
         <w:u w:val="none"/>
@@ -13818,7 +13984,7 @@
       <w:lvlText w:val="●"/>
       <w:lvlJc w:val="left"/>
       <w:pPr>
-        <w:ind w:left="5040" w:hanging="360"/>
+        <w:ind w:left="5760" w:hanging="360"/>
       </w:pPr>
       <w:rPr>
         <w:u w:val="none"/>
@@ -13830,7 +13996,7 @@
       <w:lvlText w:val="○"/>
       <w:lvlJc w:val="left"/>
       <w:pPr>
-        <w:ind w:left="5760" w:hanging="360"/>
+        <w:ind w:left="6480" w:hanging="360"/>
       </w:pPr>
       <w:rPr>
         <w:u w:val="none"/>
@@ -13842,7 +14008,7 @@
       <w:lvlText w:val="■"/>
       <w:lvlJc w:val="left"/>
       <w:pPr>
-        <w:ind w:left="6480" w:hanging="360"/>
+        <w:ind w:left="7200" w:hanging="360"/>
       </w:pPr>
       <w:rPr>
         <w:u w:val="none"/>
@@ -13856,103 +14022,103 @@
       <w:lvlText w:val="●"/>
       <w:lvlJc w:val="left"/>
       <w:pPr>
+        <w:ind w:left="720" w:hanging="360"/>
+      </w:pPr>
+      <w:rPr>
+        <w:u w:val="none"/>
+      </w:rPr>
+    </w:lvl>
+    <w:lvl w:ilvl="1">
+      <w:start w:val="1"/>
+      <w:numFmt w:val="bullet"/>
+      <w:lvlText w:val="○"/>
+      <w:lvlJc w:val="left"/>
+      <w:pPr>
         <w:ind w:left="1440" w:hanging="360"/>
       </w:pPr>
       <w:rPr>
         <w:u w:val="none"/>
       </w:rPr>
     </w:lvl>
-    <w:lvl w:ilvl="1">
+    <w:lvl w:ilvl="2">
+      <w:start w:val="1"/>
+      <w:numFmt w:val="bullet"/>
+      <w:lvlText w:val="■"/>
+      <w:lvlJc w:val="left"/>
+      <w:pPr>
+        <w:ind w:left="2160" w:hanging="360"/>
+      </w:pPr>
+      <w:rPr>
+        <w:u w:val="none"/>
+      </w:rPr>
+    </w:lvl>
+    <w:lvl w:ilvl="3">
+      <w:start w:val="1"/>
+      <w:numFmt w:val="bullet"/>
+      <w:lvlText w:val="●"/>
+      <w:lvlJc w:val="left"/>
+      <w:pPr>
+        <w:ind w:left="2880" w:hanging="360"/>
+      </w:pPr>
+      <w:rPr>
+        <w:u w:val="none"/>
+      </w:rPr>
+    </w:lvl>
+    <w:lvl w:ilvl="4">
       <w:start w:val="1"/>
       <w:numFmt w:val="bullet"/>
       <w:lvlText w:val="○"/>
       <w:lvlJc w:val="left"/>
       <w:pPr>
-        <w:ind w:left="2160" w:hanging="360"/>
-      </w:pPr>
-      <w:rPr>
-        <w:u w:val="none"/>
-      </w:rPr>
-    </w:lvl>
-    <w:lvl w:ilvl="2">
+        <w:ind w:left="3600" w:hanging="360"/>
+      </w:pPr>
+      <w:rPr>
+        <w:u w:val="none"/>
+      </w:rPr>
+    </w:lvl>
+    <w:lvl w:ilvl="5">
       <w:start w:val="1"/>
       <w:numFmt w:val="bullet"/>
       <w:lvlText w:val="■"/>
       <w:lvlJc w:val="left"/>
       <w:pPr>
-        <w:ind w:left="2880" w:hanging="360"/>
-      </w:pPr>
-      <w:rPr>
-        <w:u w:val="none"/>
-      </w:rPr>
-    </w:lvl>
-    <w:lvl w:ilvl="3">
+        <w:ind w:left="4320" w:hanging="360"/>
+      </w:pPr>
+      <w:rPr>
+        <w:u w:val="none"/>
+      </w:rPr>
+    </w:lvl>
+    <w:lvl w:ilvl="6">
       <w:start w:val="1"/>
       <w:numFmt w:val="bullet"/>
       <w:lvlText w:val="●"/>
       <w:lvlJc w:val="left"/>
       <w:pPr>
-        <w:ind w:left="3600" w:hanging="360"/>
-      </w:pPr>
-      <w:rPr>
-        <w:u w:val="none"/>
-      </w:rPr>
-    </w:lvl>
-    <w:lvl w:ilvl="4">
+        <w:ind w:left="5040" w:hanging="360"/>
+      </w:pPr>
+      <w:rPr>
+        <w:u w:val="none"/>
+      </w:rPr>
+    </w:lvl>
+    <w:lvl w:ilvl="7">
       <w:start w:val="1"/>
       <w:numFmt w:val="bullet"/>
       <w:lvlText w:val="○"/>
       <w:lvlJc w:val="left"/>
       <w:pPr>
-        <w:ind w:left="4320" w:hanging="360"/>
-      </w:pPr>
-      <w:rPr>
-        <w:u w:val="none"/>
-      </w:rPr>
-    </w:lvl>
-    <w:lvl w:ilvl="5">
+        <w:ind w:left="5760" w:hanging="360"/>
+      </w:pPr>
+      <w:rPr>
+        <w:u w:val="none"/>
+      </w:rPr>
+    </w:lvl>
+    <w:lvl w:ilvl="8">
       <w:start w:val="1"/>
       <w:numFmt w:val="bullet"/>
       <w:lvlText w:val="■"/>
       <w:lvlJc w:val="left"/>
       <w:pPr>
-        <w:ind w:left="5040" w:hanging="360"/>
-      </w:pPr>
-      <w:rPr>
-        <w:u w:val="none"/>
-      </w:rPr>
-    </w:lvl>
-    <w:lvl w:ilvl="6">
-      <w:start w:val="1"/>
-      <w:numFmt w:val="bullet"/>
-      <w:lvlText w:val="●"/>
-      <w:lvlJc w:val="left"/>
-      <w:pPr>
-        <w:ind w:left="5760" w:hanging="360"/>
-      </w:pPr>
-      <w:rPr>
-        <w:u w:val="none"/>
-      </w:rPr>
-    </w:lvl>
-    <w:lvl w:ilvl="7">
-      <w:start w:val="1"/>
-      <w:numFmt w:val="bullet"/>
-      <w:lvlText w:val="○"/>
-      <w:lvlJc w:val="left"/>
-      <w:pPr>
         <w:ind w:left="6480" w:hanging="360"/>
-      </w:pPr>
-      <w:rPr>
-        <w:u w:val="none"/>
-      </w:rPr>
-    </w:lvl>
-    <w:lvl w:ilvl="8">
-      <w:start w:val="1"/>
-      <w:numFmt w:val="bullet"/>
-      <w:lvlText w:val="■"/>
-      <w:lvlJc w:val="left"/>
-      <w:pPr>
-        <w:ind w:left="7200" w:hanging="360"/>
       </w:pPr>
       <w:rPr>
         <w:u w:val="none"/>
@@ -14076,10 +14242,9 @@
       <w:lvlText w:val="●"/>
       <w:lvlJc w:val="left"/>
       <w:pPr>
-        <w:ind w:left="720" w:hanging="360"/>
-      </w:pPr>
-      <w:rPr>
-        <w:rFonts w:ascii="Arial" w:cs="Arial" w:eastAsia="Arial" w:hAnsi="Arial"/>
+        <w:ind w:left="1440" w:hanging="360"/>
+      </w:pPr>
+      <w:rPr>
         <w:u w:val="none"/>
       </w:rPr>
     </w:lvl>
@@ -14089,7 +14254,7 @@
       <w:lvlText w:val="○"/>
       <w:lvlJc w:val="left"/>
       <w:pPr>
-        <w:ind w:left="1440" w:hanging="360"/>
+        <w:ind w:left="2160" w:hanging="360"/>
       </w:pPr>
       <w:rPr>
         <w:u w:val="none"/>
@@ -14101,7 +14266,7 @@
       <w:lvlText w:val="■"/>
       <w:lvlJc w:val="left"/>
       <w:pPr>
-        <w:ind w:left="2160" w:hanging="360"/>
+        <w:ind w:left="2880" w:hanging="360"/>
       </w:pPr>
       <w:rPr>
         <w:u w:val="none"/>
@@ -14113,7 +14278,7 @@
       <w:lvlText w:val="●"/>
       <w:lvlJc w:val="left"/>
       <w:pPr>
-        <w:ind w:left="2880" w:hanging="360"/>
+        <w:ind w:left="3600" w:hanging="360"/>
       </w:pPr>
       <w:rPr>
         <w:u w:val="none"/>
@@ -14125,7 +14290,7 @@
       <w:lvlText w:val="○"/>
       <w:lvlJc w:val="left"/>
       <w:pPr>
-        <w:ind w:left="3600" w:hanging="360"/>
+        <w:ind w:left="4320" w:hanging="360"/>
       </w:pPr>
       <w:rPr>
         <w:u w:val="none"/>
@@ -14137,7 +14302,7 @@
       <w:lvlText w:val="■"/>
       <w:lvlJc w:val="left"/>
       <w:pPr>
-        <w:ind w:left="4320" w:hanging="360"/>
+        <w:ind w:left="5040" w:hanging="360"/>
       </w:pPr>
       <w:rPr>
         <w:u w:val="none"/>
@@ -14149,7 +14314,7 @@
       <w:lvlText w:val="●"/>
       <w:lvlJc w:val="left"/>
       <w:pPr>
-        <w:ind w:left="5040" w:hanging="360"/>
+        <w:ind w:left="5760" w:hanging="360"/>
       </w:pPr>
       <w:rPr>
         <w:u w:val="none"/>
@@ -14161,7 +14326,7 @@
       <w:lvlText w:val="○"/>
       <w:lvlJc w:val="left"/>
       <w:pPr>
-        <w:ind w:left="5760" w:hanging="360"/>
+        <w:ind w:left="6480" w:hanging="360"/>
       </w:pPr>
       <w:rPr>
         <w:u w:val="none"/>
@@ -14173,7 +14338,7 @@
       <w:lvlText w:val="■"/>
       <w:lvlJc w:val="left"/>
       <w:pPr>
-        <w:ind w:left="6480" w:hanging="360"/>
+        <w:ind w:left="7200" w:hanging="360"/>
       </w:pPr>
       <w:rPr>
         <w:u w:val="none"/>
@@ -14297,103 +14462,104 @@
       <w:lvlText w:val="●"/>
       <w:lvlJc w:val="left"/>
       <w:pPr>
+        <w:ind w:left="720" w:hanging="360"/>
+      </w:pPr>
+      <w:rPr>
+        <w:rFonts w:ascii="Arial" w:cs="Arial" w:eastAsia="Arial" w:hAnsi="Arial"/>
+        <w:u w:val="none"/>
+      </w:rPr>
+    </w:lvl>
+    <w:lvl w:ilvl="1">
+      <w:start w:val="1"/>
+      <w:numFmt w:val="bullet"/>
+      <w:lvlText w:val="○"/>
+      <w:lvlJc w:val="left"/>
+      <w:pPr>
         <w:ind w:left="1440" w:hanging="360"/>
       </w:pPr>
       <w:rPr>
         <w:u w:val="none"/>
       </w:rPr>
     </w:lvl>
-    <w:lvl w:ilvl="1">
+    <w:lvl w:ilvl="2">
+      <w:start w:val="1"/>
+      <w:numFmt w:val="bullet"/>
+      <w:lvlText w:val="■"/>
+      <w:lvlJc w:val="left"/>
+      <w:pPr>
+        <w:ind w:left="2160" w:hanging="360"/>
+      </w:pPr>
+      <w:rPr>
+        <w:u w:val="none"/>
+      </w:rPr>
+    </w:lvl>
+    <w:lvl w:ilvl="3">
+      <w:start w:val="1"/>
+      <w:numFmt w:val="bullet"/>
+      <w:lvlText w:val="●"/>
+      <w:lvlJc w:val="left"/>
+      <w:pPr>
+        <w:ind w:left="2880" w:hanging="360"/>
+      </w:pPr>
+      <w:rPr>
+        <w:u w:val="none"/>
+      </w:rPr>
+    </w:lvl>
+    <w:lvl w:ilvl="4">
       <w:start w:val="1"/>
       <w:numFmt w:val="bullet"/>
       <w:lvlText w:val="○"/>
       <w:lvlJc w:val="left"/>
       <w:pPr>
-        <w:ind w:left="2160" w:hanging="360"/>
-      </w:pPr>
-      <w:rPr>
-        <w:u w:val="none"/>
-      </w:rPr>
-    </w:lvl>
-    <w:lvl w:ilvl="2">
+        <w:ind w:left="3600" w:hanging="360"/>
+      </w:pPr>
+      <w:rPr>
+        <w:u w:val="none"/>
+      </w:rPr>
+    </w:lvl>
+    <w:lvl w:ilvl="5">
       <w:start w:val="1"/>
       <w:numFmt w:val="bullet"/>
       <w:lvlText w:val="■"/>
       <w:lvlJc w:val="left"/>
       <w:pPr>
-        <w:ind w:left="2880" w:hanging="360"/>
-      </w:pPr>
-      <w:rPr>
-        <w:u w:val="none"/>
-      </w:rPr>
-    </w:lvl>
-    <w:lvl w:ilvl="3">
+        <w:ind w:left="4320" w:hanging="360"/>
+      </w:pPr>
+      <w:rPr>
+        <w:u w:val="none"/>
+      </w:rPr>
+    </w:lvl>
+    <w:lvl w:ilvl="6">
       <w:start w:val="1"/>
       <w:numFmt w:val="bullet"/>
       <w:lvlText w:val="●"/>
       <w:lvlJc w:val="left"/>
       <w:pPr>
-        <w:ind w:left="3600" w:hanging="360"/>
-      </w:pPr>
-      <w:rPr>
-        <w:u w:val="none"/>
-      </w:rPr>
-    </w:lvl>
-    <w:lvl w:ilvl="4">
+        <w:ind w:left="5040" w:hanging="360"/>
+      </w:pPr>
+      <w:rPr>
+        <w:u w:val="none"/>
+      </w:rPr>
+    </w:lvl>
+    <w:lvl w:ilvl="7">
       <w:start w:val="1"/>
       <w:numFmt w:val="bullet"/>
       <w:lvlText w:val="○"/>
       <w:lvlJc w:val="left"/>
       <w:pPr>
-        <w:ind w:left="4320" w:hanging="360"/>
-      </w:pPr>
-      <w:rPr>
-        <w:u w:val="none"/>
-      </w:rPr>
-    </w:lvl>
-    <w:lvl w:ilvl="5">
+        <w:ind w:left="5760" w:hanging="360"/>
+      </w:pPr>
+      <w:rPr>
+        <w:u w:val="none"/>
+      </w:rPr>
+    </w:lvl>
+    <w:lvl w:ilvl="8">
       <w:start w:val="1"/>
       <w:numFmt w:val="bullet"/>
       <w:lvlText w:val="■"/>
       <w:lvlJc w:val="left"/>
       <w:pPr>
-        <w:ind w:left="5040" w:hanging="360"/>
-      </w:pPr>
-      <w:rPr>
-        <w:u w:val="none"/>
-      </w:rPr>
-    </w:lvl>
-    <w:lvl w:ilvl="6">
-      <w:start w:val="1"/>
-      <w:numFmt w:val="bullet"/>
-      <w:lvlText w:val="●"/>
-      <w:lvlJc w:val="left"/>
-      <w:pPr>
-        <w:ind w:left="5760" w:hanging="360"/>
-      </w:pPr>
-      <w:rPr>
-        <w:u w:val="none"/>
-      </w:rPr>
-    </w:lvl>
-    <w:lvl w:ilvl="7">
-      <w:start w:val="1"/>
-      <w:numFmt w:val="bullet"/>
-      <w:lvlText w:val="○"/>
-      <w:lvlJc w:val="left"/>
-      <w:pPr>
         <w:ind w:left="6480" w:hanging="360"/>
-      </w:pPr>
-      <w:rPr>
-        <w:u w:val="none"/>
-      </w:rPr>
-    </w:lvl>
-    <w:lvl w:ilvl="8">
-      <w:start w:val="1"/>
-      <w:numFmt w:val="bullet"/>
-      <w:lvlText w:val="■"/>
-      <w:lvlJc w:val="left"/>
-      <w:pPr>
-        <w:ind w:left="7200" w:hanging="360"/>
       </w:pPr>
       <w:rPr>
         <w:u w:val="none"/>
@@ -14511,6 +14677,226 @@
     </w:lvl>
   </w:abstractNum>
   <w:abstractNum w:abstractNumId="35">
+    <w:lvl w:ilvl="0">
+      <w:start w:val="1"/>
+      <w:numFmt w:val="bullet"/>
+      <w:lvlText w:val="●"/>
+      <w:lvlJc w:val="left"/>
+      <w:pPr>
+        <w:ind w:left="1440" w:hanging="360"/>
+      </w:pPr>
+      <w:rPr>
+        <w:u w:val="none"/>
+      </w:rPr>
+    </w:lvl>
+    <w:lvl w:ilvl="1">
+      <w:start w:val="1"/>
+      <w:numFmt w:val="bullet"/>
+      <w:lvlText w:val="○"/>
+      <w:lvlJc w:val="left"/>
+      <w:pPr>
+        <w:ind w:left="2160" w:hanging="360"/>
+      </w:pPr>
+      <w:rPr>
+        <w:u w:val="none"/>
+      </w:rPr>
+    </w:lvl>
+    <w:lvl w:ilvl="2">
+      <w:start w:val="1"/>
+      <w:numFmt w:val="bullet"/>
+      <w:lvlText w:val="■"/>
+      <w:lvlJc w:val="left"/>
+      <w:pPr>
+        <w:ind w:left="2880" w:hanging="360"/>
+      </w:pPr>
+      <w:rPr>
+        <w:u w:val="none"/>
+      </w:rPr>
+    </w:lvl>
+    <w:lvl w:ilvl="3">
+      <w:start w:val="1"/>
+      <w:numFmt w:val="bullet"/>
+      <w:lvlText w:val="●"/>
+      <w:lvlJc w:val="left"/>
+      <w:pPr>
+        <w:ind w:left="3600" w:hanging="360"/>
+      </w:pPr>
+      <w:rPr>
+        <w:u w:val="none"/>
+      </w:rPr>
+    </w:lvl>
+    <w:lvl w:ilvl="4">
+      <w:start w:val="1"/>
+      <w:numFmt w:val="bullet"/>
+      <w:lvlText w:val="○"/>
+      <w:lvlJc w:val="left"/>
+      <w:pPr>
+        <w:ind w:left="4320" w:hanging="360"/>
+      </w:pPr>
+      <w:rPr>
+        <w:u w:val="none"/>
+      </w:rPr>
+    </w:lvl>
+    <w:lvl w:ilvl="5">
+      <w:start w:val="1"/>
+      <w:numFmt w:val="bullet"/>
+      <w:lvlText w:val="■"/>
+      <w:lvlJc w:val="left"/>
+      <w:pPr>
+        <w:ind w:left="5040" w:hanging="360"/>
+      </w:pPr>
+      <w:rPr>
+        <w:u w:val="none"/>
+      </w:rPr>
+    </w:lvl>
+    <w:lvl w:ilvl="6">
+      <w:start w:val="1"/>
+      <w:numFmt w:val="bullet"/>
+      <w:lvlText w:val="●"/>
+      <w:lvlJc w:val="left"/>
+      <w:pPr>
+        <w:ind w:left="5760" w:hanging="360"/>
+      </w:pPr>
+      <w:rPr>
+        <w:u w:val="none"/>
+      </w:rPr>
+    </w:lvl>
+    <w:lvl w:ilvl="7">
+      <w:start w:val="1"/>
+      <w:numFmt w:val="bullet"/>
+      <w:lvlText w:val="○"/>
+      <w:lvlJc w:val="left"/>
+      <w:pPr>
+        <w:ind w:left="6480" w:hanging="360"/>
+      </w:pPr>
+      <w:rPr>
+        <w:u w:val="none"/>
+      </w:rPr>
+    </w:lvl>
+    <w:lvl w:ilvl="8">
+      <w:start w:val="1"/>
+      <w:numFmt w:val="bullet"/>
+      <w:lvlText w:val="■"/>
+      <w:lvlJc w:val="left"/>
+      <w:pPr>
+        <w:ind w:left="7200" w:hanging="360"/>
+      </w:pPr>
+      <w:rPr>
+        <w:u w:val="none"/>
+      </w:rPr>
+    </w:lvl>
+  </w:abstractNum>
+  <w:abstractNum w:abstractNumId="36">
+    <w:lvl w:ilvl="0">
+      <w:start w:val="1"/>
+      <w:numFmt w:val="bullet"/>
+      <w:lvlText w:val="●"/>
+      <w:lvlJc w:val="left"/>
+      <w:pPr>
+        <w:ind w:left="1440" w:hanging="360"/>
+      </w:pPr>
+      <w:rPr>
+        <w:u w:val="none"/>
+      </w:rPr>
+    </w:lvl>
+    <w:lvl w:ilvl="1">
+      <w:start w:val="1"/>
+      <w:numFmt w:val="bullet"/>
+      <w:lvlText w:val="○"/>
+      <w:lvlJc w:val="left"/>
+      <w:pPr>
+        <w:ind w:left="2160" w:hanging="360"/>
+      </w:pPr>
+      <w:rPr>
+        <w:u w:val="none"/>
+      </w:rPr>
+    </w:lvl>
+    <w:lvl w:ilvl="2">
+      <w:start w:val="1"/>
+      <w:numFmt w:val="bullet"/>
+      <w:lvlText w:val="■"/>
+      <w:lvlJc w:val="left"/>
+      <w:pPr>
+        <w:ind w:left="2880" w:hanging="360"/>
+      </w:pPr>
+      <w:rPr>
+        <w:u w:val="none"/>
+      </w:rPr>
+    </w:lvl>
+    <w:lvl w:ilvl="3">
+      <w:start w:val="1"/>
+      <w:numFmt w:val="bullet"/>
+      <w:lvlText w:val="●"/>
+      <w:lvlJc w:val="left"/>
+      <w:pPr>
+        <w:ind w:left="3600" w:hanging="360"/>
+      </w:pPr>
+      <w:rPr>
+        <w:u w:val="none"/>
+      </w:rPr>
+    </w:lvl>
+    <w:lvl w:ilvl="4">
+      <w:start w:val="1"/>
+      <w:numFmt w:val="bullet"/>
+      <w:lvlText w:val="○"/>
+      <w:lvlJc w:val="left"/>
+      <w:pPr>
+        <w:ind w:left="4320" w:hanging="360"/>
+      </w:pPr>
+      <w:rPr>
+        <w:u w:val="none"/>
+      </w:rPr>
+    </w:lvl>
+    <w:lvl w:ilvl="5">
+      <w:start w:val="1"/>
+      <w:numFmt w:val="bullet"/>
+      <w:lvlText w:val="■"/>
+      <w:lvlJc w:val="left"/>
+      <w:pPr>
+        <w:ind w:left="5040" w:hanging="360"/>
+      </w:pPr>
+      <w:rPr>
+        <w:u w:val="none"/>
+      </w:rPr>
+    </w:lvl>
+    <w:lvl w:ilvl="6">
+      <w:start w:val="1"/>
+      <w:numFmt w:val="bullet"/>
+      <w:lvlText w:val="●"/>
+      <w:lvlJc w:val="left"/>
+      <w:pPr>
+        <w:ind w:left="5760" w:hanging="360"/>
+      </w:pPr>
+      <w:rPr>
+        <w:u w:val="none"/>
+      </w:rPr>
+    </w:lvl>
+    <w:lvl w:ilvl="7">
+      <w:start w:val="1"/>
+      <w:numFmt w:val="bullet"/>
+      <w:lvlText w:val="○"/>
+      <w:lvlJc w:val="left"/>
+      <w:pPr>
+        <w:ind w:left="6480" w:hanging="360"/>
+      </w:pPr>
+      <w:rPr>
+        <w:u w:val="none"/>
+      </w:rPr>
+    </w:lvl>
+    <w:lvl w:ilvl="8">
+      <w:start w:val="1"/>
+      <w:numFmt w:val="bullet"/>
+      <w:lvlText w:val="■"/>
+      <w:lvlJc w:val="left"/>
+      <w:pPr>
+        <w:ind w:left="7200" w:hanging="360"/>
+      </w:pPr>
+      <w:rPr>
+        <w:u w:val="none"/>
+      </w:rPr>
+    </w:lvl>
+  </w:abstractNum>
+  <w:abstractNum w:abstractNumId="37">
     <w:lvl w:ilvl="0">
       <w:start w:val="1"/>
       <w:numFmt w:val="bullet"/>
@@ -14724,6 +15110,12 @@
   </w:num>
   <w:num w:numId="35">
     <w:abstractNumId w:val="35"/>
+  </w:num>
+  <w:num w:numId="36">
+    <w:abstractNumId w:val="36"/>
+  </w:num>
+  <w:num w:numId="37">
+    <w:abstractNumId w:val="37"/>
   </w:num>
 </w:numbering>
 </file>

</xml_diff>